<commit_message>
feat: add volume 1 interior prototype
</commit_message>
<xml_diff>
--- a/downloads/production/kdp/interior-finalization/lady-d-kdp-interior-finalization-kit.docx
+++ b/downloads/production/kdp/interior-finalization/lady-d-kdp-interior-finalization-kit.docx
@@ -543,6 +543,16 @@
         <w:ind w:left="540" w:hanging="271"/>
       </w:pPr>
       <w:r>
+        <w:t>Volume 1 6 x 9 interior prototype package generated for the first seven devotional entries.</w:t>
+      </w:r>
+    </w:p>
+    <w:p>
+      <w:pPr>
+        <w:pStyle w:val="ListBullet"/>
+        <w:spacing w:after="80" w:line="300" w:lineRule="auto"/>
+        <w:ind w:left="540" w:hanging="271"/>
+      </w:pPr>
+      <w:r>
         <w:t>Public Vercel review page for author-facing review.</w:t>
       </w:r>
     </w:p>
@@ -936,7 +946,7 @@
         <w:ind w:left="540" w:hanging="271"/>
       </w:pPr>
       <w:r>
-        <w:t>Final 6 x 9 designed interiors with locked page counts.</w:t>
+        <w:t>Full 6 x 9 designed interiors with locked page counts.</w:t>
       </w:r>
     </w:p>
     <w:p>
@@ -979,7 +989,7 @@
     </w:p>
     <w:p>
       <w:r>
-        <w:t>Build the final 6 x 9 interior template for Volume 1 first, using the front/back matter template in this kit. Once the template passes render QA, apply the same system to Volumes 2 and 3, then to the companion journals.</w:t>
+        <w:t>Use the Volume 1 6 x 9 prototype as the first approved rhythm candidate, then flow the full Volume 1 manuscript through that system. Once the full Volume 1 interior passes render QA, apply the same system to Volumes 2 and 3, then to the companion journals.</w:t>
       </w:r>
     </w:p>
     <w:sectPr>

</xml_diff>

<commit_message>
feat: add volume 1 full interior draft
</commit_message>
<xml_diff>
--- a/downloads/production/kdp/interior-finalization/lady-d-kdp-interior-finalization-kit.docx
+++ b/downloads/production/kdp/interior-finalization/lady-d-kdp-interior-finalization-kit.docx
@@ -553,6 +553,16 @@
         <w:ind w:left="540" w:hanging="271"/>
       </w:pPr>
       <w:r>
+        <w:t>Full Volume 1 6 x 9 interior review draft generated with all 366 entries.</w:t>
+      </w:r>
+    </w:p>
+    <w:p>
+      <w:pPr>
+        <w:pStyle w:val="ListBullet"/>
+        <w:spacing w:after="80" w:line="300" w:lineRule="auto"/>
+        <w:ind w:left="540" w:hanging="271"/>
+      </w:pPr>
+      <w:r>
         <w:t>Public Vercel review page for author-facing review.</w:t>
       </w:r>
     </w:p>
@@ -989,7 +999,7 @@
     </w:p>
     <w:p>
       <w:r>
-        <w:t>Use the Volume 1 6 x 9 prototype as the first approved rhythm candidate, then flow the full Volume 1 manuscript through that system. Once the full Volume 1 interior passes render QA, apply the same system to Volumes 2 and 3, then to the companion journals.</w:t>
+        <w:t>Use the full Volume 1 6 x 9 interior review draft as the next copyedit and theological proof surface. Once Volume 1 is approved and page count is locked, regenerate its full-wrap cover, then apply the same interior system to Volumes 2 and 3 and the companion journals.</w:t>
       </w:r>
     </w:p>
     <w:sectPr>

</xml_diff>

<commit_message>
feat: add trilogy full interior drafts
</commit_message>
<xml_diff>
--- a/downloads/production/kdp/interior-finalization/lady-d-kdp-interior-finalization-kit.docx
+++ b/downloads/production/kdp/interior-finalization/lady-d-kdp-interior-finalization-kit.docx
@@ -553,7 +553,7 @@
         <w:ind w:left="540" w:hanging="271"/>
       </w:pPr>
       <w:r>
-        <w:t>Full Volume 1 6 x 9 interior review draft generated with all 366 entries.</w:t>
+        <w:t>Full 6 x 9 interior review drafts generated for Volumes 1, 2, and 3 with 366 entries each.</w:t>
       </w:r>
     </w:p>
     <w:p>
@@ -956,7 +956,7 @@
         <w:ind w:left="540" w:hanging="271"/>
       </w:pPr>
       <w:r>
-        <w:t>Full 6 x 9 designed interiors with locked page counts.</w:t>
+        <w:t>Final copyedited 6 x 9 interiors with locked page counts.</w:t>
       </w:r>
     </w:p>
     <w:p>
@@ -999,7 +999,7 @@
     </w:p>
     <w:p>
       <w:r>
-        <w:t>Use the full Volume 1 6 x 9 interior review draft as the next copyedit and theological proof surface. Once Volume 1 is approved and page count is locked, regenerate its full-wrap cover, then apply the same interior system to Volumes 2 and 3 and the companion journals.</w:t>
+        <w:t>Use the full 6 x 9 interior review drafts as the next trilogy-wide copyedit and theological proof surface. Once each devotional volume is approved and page counts are locked, regenerate the full-wrap covers, then apply the same interior rhythm to the companion journals.</w:t>
       </w:r>
     </w:p>
     <w:sectPr>

</xml_diff>

<commit_message>
feat: add trilogy companion journal drafts
</commit_message>
<xml_diff>
--- a/downloads/production/kdp/interior-finalization/lady-d-kdp-interior-finalization-kit.docx
+++ b/downloads/production/kdp/interior-finalization/lady-d-kdp-interior-finalization-kit.docx
@@ -242,11 +242,11 @@
                 <w:b w:val="0"/>
                 <w:color w:val="111827"/>
               </w:rPr>
-              <w:t>409 manuscript pages</w:t>
+              <w:t>409 devotional pages</w:t>
               <w:br/>
-              <w:t>94 journal pages</w:t>
+              <w:t>470 journal pages</w:t>
               <w:br/>
-              <w:t>131,305 manuscript words</w:t>
+              <w:t>131,305 devotional words</w:t>
             </w:r>
           </w:p>
         </w:tc>
@@ -268,9 +268,13 @@
                 <w:b w:val="0"/>
                 <w:color w:val="111827"/>
               </w:rPr>
-              <w:t>White: 13.171 x 9.250 in</w:t>
+              <w:t>Devotional white: 13.171 x 9.250 in</w:t>
               <w:br/>
-              <w:t>Cream: 13.273 x 9.250 in</w:t>
+              <w:t>Devotional cream: 13.273 x 9.250 in</w:t>
+              <w:br/>
+              <w:t>Journal white: 13.308 x 9.250 in</w:t>
+              <w:br/>
+              <w:t>Journal cream: 13.425 x 9.250 in</w:t>
             </w:r>
           </w:p>
         </w:tc>
@@ -338,11 +342,11 @@
                 <w:b w:val="0"/>
                 <w:color w:val="111827"/>
               </w:rPr>
-              <w:t>350 manuscript pages</w:t>
+              <w:t>350 devotional pages</w:t>
               <w:br/>
-              <w:t>81 journal pages</w:t>
+              <w:t>477 journal pages</w:t>
               <w:br/>
-              <w:t>98,804 manuscript words</w:t>
+              <w:t>98,804 devotional words</w:t>
             </w:r>
           </w:p>
         </w:tc>
@@ -364,9 +368,13 @@
                 <w:b w:val="0"/>
                 <w:color w:val="111827"/>
               </w:rPr>
-              <w:t>White: 13.038 x 9.250 in</w:t>
+              <w:t>Devotional white: 13.038 x 9.250 in</w:t>
               <w:br/>
-              <w:t>Cream: 13.125 x 9.250 in</w:t>
+              <w:t>Devotional cream: 13.125 x 9.250 in</w:t>
+              <w:br/>
+              <w:t>Journal white: 13.324 x 9.250 in</w:t>
+              <w:br/>
+              <w:t>Journal cream: 13.443 x 9.250 in</w:t>
             </w:r>
           </w:p>
         </w:tc>
@@ -434,11 +442,11 @@
                 <w:b w:val="0"/>
                 <w:color w:val="111827"/>
               </w:rPr>
-              <w:t>339 manuscript pages</w:t>
+              <w:t>339 devotional pages</w:t>
               <w:br/>
-              <w:t>90 journal pages</w:t>
+              <w:t>483 journal pages</w:t>
               <w:br/>
-              <w:t>95,247 manuscript words</w:t>
+              <w:t>95,247 devotional words</w:t>
             </w:r>
           </w:p>
         </w:tc>
@@ -460,9 +468,13 @@
                 <w:b w:val="0"/>
                 <w:color w:val="111827"/>
               </w:rPr>
-              <w:t>White: 13.013 x 9.250 in</w:t>
+              <w:t>Devotional white: 13.013 x 9.250 in</w:t>
               <w:br/>
-              <w:t>Cream: 13.098 x 9.250 in</w:t>
+              <w:t>Devotional cream: 13.098 x 9.250 in</w:t>
+              <w:br/>
+              <w:t>Journal white: 13.338 x 9.250 in</w:t>
+              <w:br/>
+              <w:t>Journal cream: 13.457 x 9.250 in</w:t>
             </w:r>
           </w:p>
         </w:tc>
@@ -554,6 +566,16 @@
       </w:pPr>
       <w:r>
         <w:t>Full 6 x 9 interior review drafts generated for Volumes 1, 2, and 3 with 366 entries each.</w:t>
+      </w:r>
+    </w:p>
+    <w:p>
+      <w:pPr>
+        <w:pStyle w:val="ListBullet"/>
+        <w:spacing w:after="80" w:line="300" w:lineRule="auto"/>
+        <w:ind w:left="540" w:hanging="271"/>
+      </w:pPr>
+      <w:r>
+        <w:t>Full 6 x 9 companion journal review drafts generated for Volumes 1, 2, and 3.</w:t>
       </w:r>
     </w:p>
     <w:p>
@@ -956,7 +978,7 @@
         <w:ind w:left="540" w:hanging="271"/>
       </w:pPr>
       <w:r>
-        <w:t>Final copyedited 6 x 9 interiors with locked page counts.</w:t>
+        <w:t>Final approved 6 x 9 devotional and journal upload interiors with locked page counts.</w:t>
       </w:r>
     </w:p>
     <w:p>
@@ -999,7 +1021,7 @@
     </w:p>
     <w:p>
       <w:r>
-        <w:t>Use the full 6 x 9 interior review drafts as the next trilogy-wide copyedit and theological proof surface. Once each devotional volume is approved and page counts are locked, regenerate the full-wrap covers, then apply the same interior rhythm to the companion journals.</w:t>
+        <w:t>Use the devotional and companion journal 6 x 9 review drafts as the next trilogy-wide copyedit and theological proof surface. Once each volume and journal is approved, regenerate the full-wrap covers from the locked page counts and paper type.</w:t>
       </w:r>
     </w:p>
     <w:sectPr>

</xml_diff>

<commit_message>
feat: add companion journal full-wrap drafts
</commit_message>
<xml_diff>
--- a/downloads/production/kdp/interior-finalization/lady-d-kdp-interior-finalization-kit.docx
+++ b/downloads/production/kdp/interior-finalization/lady-d-kdp-interior-finalization-kit.docx
@@ -545,6 +545,16 @@
         <w:ind w:left="540" w:hanging="271"/>
       </w:pPr>
       <w:r>
+        <w:t>Path-route full-wrap draft covers generated for the three companion journals.</w:t>
+      </w:r>
+    </w:p>
+    <w:p>
+      <w:pPr>
+        <w:pStyle w:val="ListBullet"/>
+        <w:spacing w:after="80" w:line="300" w:lineRule="auto"/>
+        <w:ind w:left="540" w:hanging="271"/>
+      </w:pPr>
+      <w:r>
         <w:t>KDP trim and cover readiness worksheet generated from current official KDP guidance.</w:t>
       </w:r>
     </w:p>

</xml_diff>

<commit_message>
feat: add release upload readiness pack
</commit_message>
<xml_diff>
--- a/downloads/production/kdp/interior-finalization/lady-d-kdp-interior-finalization-kit.docx
+++ b/downloads/production/kdp/interior-finalization/lady-d-kdp-interior-finalization-kit.docx
@@ -4,66 +4,40 @@
   <w:body>
     <w:p>
       <w:pPr>
-        <w:spacing w:after="200"/>
-        <w:jc w:val="left"/>
+        <w:pStyle w:val="Title"/>
       </w:pPr>
       <w:r>
-        <w:rPr>
-          <w:rFonts w:ascii="Calibri" w:hAnsi="Calibri"/>
-          <w:b w:val="0"/>
-          <w:color w:val="1F4D78"/>
-          <w:sz w:val="52"/>
-        </w:rPr>
         <w:t>Lady D KDP Interior Finalization Kit</w:t>
       </w:r>
     </w:p>
     <w:p>
       <w:r>
-        <w:t>Prepared for Susan "Lady D" Damon - generated 2026-07-01</w:t>
+        <w:t>Generated: 2026-07-01</w:t>
       </w:r>
     </w:p>
-    <w:tbl>
-      <w:tblPr>
-        <w:tblW w:type="auto" w:w="0"/>
-        <w:jc w:val="left"/>
-        <w:tblLook w:firstColumn="1" w:firstRow="1" w:lastColumn="0" w:lastRow="0" w:noHBand="0" w:noVBand="1" w:val="04A0"/>
-      </w:tblPr>
-      <w:tblGrid>
-        <w:gridCol w:w="9360"/>
-      </w:tblGrid>
-      <w:tr>
-        <w:tc>
-          <w:tcPr>
-            <w:tcW w:type="dxa" w:w="9360"/>
-            <w:shd w:fill="F4F6F9"/>
-            <w:tcMar>
-              <w:top w:w="80" w:type="dxa"/>
-              <w:start w:w="120" w:type="dxa"/>
-              <w:bottom w:w="80" w:type="dxa"/>
-              <w:end w:w="120" w:type="dxa"/>
-            </w:tcMar>
-          </w:tcPr>
-          <w:p>
-            <w:r>
-              <w:rPr>
-                <w:rFonts w:ascii="Calibri" w:hAnsi="Calibri"/>
-                <w:b/>
-                <w:color w:val="7A5A00"/>
-              </w:rPr>
-              <w:t xml:space="preserve">Status: </w:t>
-            </w:r>
-            <w:r>
-              <w:rPr>
-                <w:rFonts w:ascii="Calibri" w:hAnsi="Calibri"/>
-                <w:b w:val="0"/>
-                <w:color w:val="111827"/>
-              </w:rPr>
-              <w:t>This is a production finalization kit, not a final KDP upload package. It defines the remaining publishing gates and the standard front/back matter system.</w:t>
-            </w:r>
-          </w:p>
-        </w:tc>
-      </w:tr>
-    </w:tbl>
+    <w:p>
+      <w:r>
+        <w:t>Repo commit at generation: 616fc26</w:t>
+      </w:r>
+    </w:p>
+    <w:p>
+      <w:r>
+        <w:t>Status: Production-planning kit. This is not a final KDP upload package.</w:t>
+      </w:r>
+    </w:p>
+    <w:p>
+      <w:pPr>
+        <w:pStyle w:val="Heading1"/>
+      </w:pPr>
+      <w:r>
+        <w:t>Purpose</w:t>
+      </w:r>
+    </w:p>
+    <w:p>
+      <w:r>
+        <w:t>The three dated devotional manuscripts are complete at 365 dated entries plus the February 29 bonus for each volume. This kit turns the next publishing phase into a concrete checklist: front matter, back matter, permissions, trim readiness, final interior design, and KDP upload gates.</w:t>
+      </w:r>
+    </w:p>
     <w:p>
       <w:pPr>
         <w:pStyle w:val="Heading1"/>
@@ -76,34 +50,25 @@
       <w:tblPr>
         <w:tblStyle w:val="TableGrid"/>
         <w:tblW w:type="auto" w:w="0"/>
-        <w:jc w:val="left"/>
         <w:tblLook w:firstColumn="1" w:firstRow="1" w:lastColumn="0" w:lastRow="0" w:noHBand="0" w:noVBand="1" w:val="04A0"/>
       </w:tblPr>
       <w:tblGrid>
-        <w:gridCol w:w="2340"/>
-        <w:gridCol w:w="2340"/>
-        <w:gridCol w:w="2340"/>
-        <w:gridCol w:w="2340"/>
+        <w:gridCol w:w="1694"/>
+        <w:gridCol w:w="1694"/>
+        <w:gridCol w:w="1694"/>
+        <w:gridCol w:w="1694"/>
+        <w:gridCol w:w="1694"/>
+        <w:gridCol w:w="1694"/>
       </w:tblGrid>
       <w:tr>
         <w:tc>
           <w:tcPr>
-            <w:tcW w:type="dxa" w:w="2340"/>
-            <w:shd w:fill="E8EEF5"/>
-            <w:tcMar>
-              <w:top w:w="80" w:type="dxa"/>
-              <w:start w:w="120" w:type="dxa"/>
-              <w:bottom w:w="80" w:type="dxa"/>
-              <w:end w:w="120" w:type="dxa"/>
-            </w:tcMar>
-            <w:vAlign w:val="center"/>
+            <w:tcW w:type="dxa" w:w="1694"/>
           </w:tcPr>
           <w:p>
             <w:r>
               <w:rPr>
-                <w:rFonts w:ascii="Calibri" w:hAnsi="Calibri"/>
                 <w:b/>
-                <w:color w:val="1F4D78"/>
               </w:rPr>
               <w:t>Volume</w:t>
             </w:r>
@@ -111,22 +76,12 @@
         </w:tc>
         <w:tc>
           <w:tcPr>
-            <w:tcW w:type="dxa" w:w="2340"/>
-            <w:shd w:fill="E8EEF5"/>
-            <w:tcMar>
-              <w:top w:w="80" w:type="dxa"/>
-              <w:start w:w="120" w:type="dxa"/>
-              <w:bottom w:w="80" w:type="dxa"/>
-              <w:end w:w="120" w:type="dxa"/>
-            </w:tcMar>
-            <w:vAlign w:val="center"/>
+            <w:tcW w:type="dxa" w:w="1694"/>
           </w:tcPr>
           <w:p>
             <w:r>
               <w:rPr>
-                <w:rFonts w:ascii="Calibri" w:hAnsi="Calibri"/>
                 <w:b/>
-                <w:color w:val="1F4D78"/>
               </w:rPr>
               <w:t>Title</w:t>
             </w:r>
@@ -134,47 +89,53 @@
         </w:tc>
         <w:tc>
           <w:tcPr>
-            <w:tcW w:type="dxa" w:w="2340"/>
-            <w:shd w:fill="E8EEF5"/>
-            <w:tcMar>
-              <w:top w:w="80" w:type="dxa"/>
-              <w:start w:w="120" w:type="dxa"/>
-              <w:bottom w:w="80" w:type="dxa"/>
-              <w:end w:w="120" w:type="dxa"/>
-            </w:tcMar>
-            <w:vAlign w:val="center"/>
+            <w:tcW w:type="dxa" w:w="1694"/>
           </w:tcPr>
           <w:p>
             <w:r>
               <w:rPr>
-                <w:rFonts w:ascii="Calibri" w:hAnsi="Calibri"/>
                 <w:b/>
-                <w:color w:val="1F4D78"/>
               </w:rPr>
-              <w:t>Current files</w:t>
+              <w:t>Devotional review pages</w:t>
             </w:r>
           </w:p>
         </w:tc>
         <w:tc>
           <w:tcPr>
-            <w:tcW w:type="dxa" w:w="2340"/>
-            <w:shd w:fill="E8EEF5"/>
-            <w:tcMar>
-              <w:top w:w="80" w:type="dxa"/>
-              <w:start w:w="120" w:type="dxa"/>
-              <w:bottom w:w="80" w:type="dxa"/>
-              <w:end w:w="120" w:type="dxa"/>
-            </w:tcMar>
-            <w:vAlign w:val="center"/>
+            <w:tcW w:type="dxa" w:w="1694"/>
           </w:tcPr>
           <w:p>
             <w:r>
               <w:rPr>
-                <w:rFonts w:ascii="Calibri" w:hAnsi="Calibri"/>
                 <w:b/>
-                <w:color w:val="1F4D78"/>
               </w:rPr>
-              <w:t>KDP working size</w:t>
+              <w:t>Companion journal 6 x 9 pages</w:t>
+            </w:r>
+          </w:p>
+        </w:tc>
+        <w:tc>
+          <w:tcPr>
+            <w:tcW w:type="dxa" w:w="1694"/>
+          </w:tcPr>
+          <w:p>
+            <w:r>
+              <w:rPr>
+                <w:b/>
+              </w:rPr>
+              <w:t>Devotional white / cream cover size</w:t>
+            </w:r>
+          </w:p>
+        </w:tc>
+        <w:tc>
+          <w:tcPr>
+            <w:tcW w:type="dxa" w:w="1694"/>
+          </w:tcPr>
+          <w:p>
+            <w:r>
+              <w:rPr>
+                <w:b/>
+              </w:rPr>
+              <w:t>Journal white / cream cover size</w:t>
             </w:r>
           </w:p>
         </w:tc>
@@ -182,99 +143,61 @@
       <w:tr>
         <w:tc>
           <w:tcPr>
-            <w:tcW w:type="dxa" w:w="1080"/>
-            <w:tcMar>
-              <w:top w:w="80" w:type="dxa"/>
-              <w:start w:w="120" w:type="dxa"/>
-              <w:bottom w:w="80" w:type="dxa"/>
-              <w:end w:w="120" w:type="dxa"/>
-            </w:tcMar>
-            <w:vAlign w:val="center"/>
+            <w:tcW w:type="dxa" w:w="1694"/>
           </w:tcPr>
           <w:p>
             <w:r>
-              <w:rPr>
-                <w:rFonts w:ascii="Calibri" w:hAnsi="Calibri"/>
-                <w:b w:val="0"/>
-                <w:color w:val="111827"/>
-              </w:rPr>
-              <w:t>Vol. 1</w:t>
+              <w:t>Volume 1</w:t>
             </w:r>
           </w:p>
         </w:tc>
         <w:tc>
           <w:tcPr>
-            <w:tcW w:type="dxa" w:w="2664"/>
-            <w:tcMar>
-              <w:top w:w="80" w:type="dxa"/>
-              <w:start w:w="120" w:type="dxa"/>
-              <w:bottom w:w="80" w:type="dxa"/>
-              <w:end w:w="120" w:type="dxa"/>
-            </w:tcMar>
-            <w:vAlign w:val="center"/>
+            <w:tcW w:type="dxa" w:w="1694"/>
           </w:tcPr>
           <w:p>
             <w:r>
-              <w:rPr>
-                <w:rFonts w:ascii="Calibri" w:hAnsi="Calibri"/>
-                <w:b w:val="0"/>
-                <w:color w:val="111827"/>
-              </w:rPr>
               <w:t>Surrendering to God's Love</w:t>
             </w:r>
           </w:p>
         </w:tc>
         <w:tc>
           <w:tcPr>
-            <w:tcW w:type="dxa" w:w="2880"/>
-            <w:tcMar>
-              <w:top w:w="80" w:type="dxa"/>
-              <w:start w:w="120" w:type="dxa"/>
-              <w:bottom w:w="80" w:type="dxa"/>
-              <w:end w:w="120" w:type="dxa"/>
-            </w:tcMar>
-            <w:vAlign w:val="center"/>
+            <w:tcW w:type="dxa" w:w="1694"/>
           </w:tcPr>
           <w:p>
             <w:r>
-              <w:rPr>
-                <w:rFonts w:ascii="Calibri" w:hAnsi="Calibri"/>
-                <w:b w:val="0"/>
-                <w:color w:val="111827"/>
-              </w:rPr>
-              <w:t>409 devotional pages</w:t>
-              <w:br/>
-              <w:t>470 journal pages</w:t>
-              <w:br/>
-              <w:t>131,305 devotional words</w:t>
+              <w:t>409</w:t>
             </w:r>
           </w:p>
         </w:tc>
         <w:tc>
           <w:tcPr>
-            <w:tcW w:type="dxa" w:w="2736"/>
-            <w:tcMar>
-              <w:top w:w="80" w:type="dxa"/>
-              <w:start w:w="120" w:type="dxa"/>
-              <w:bottom w:w="80" w:type="dxa"/>
-              <w:end w:w="120" w:type="dxa"/>
-            </w:tcMar>
-            <w:vAlign w:val="center"/>
+            <w:tcW w:type="dxa" w:w="1694"/>
           </w:tcPr>
           <w:p>
             <w:r>
-              <w:rPr>
-                <w:rFonts w:ascii="Calibri" w:hAnsi="Calibri"/>
-                <w:b w:val="0"/>
-                <w:color w:val="111827"/>
-              </w:rPr>
-              <w:t>Devotional white: 13.171 x 9.250 in</w:t>
-              <w:br/>
-              <w:t>Devotional cream: 13.273 x 9.250 in</w:t>
-              <w:br/>
-              <w:t>Journal white: 13.308 x 9.250 in</w:t>
-              <w:br/>
-              <w:t>Journal cream: 13.425 x 9.250 in</w:t>
+              <w:t>470</w:t>
+            </w:r>
+          </w:p>
+        </w:tc>
+        <w:tc>
+          <w:tcPr>
+            <w:tcW w:type="dxa" w:w="1694"/>
+          </w:tcPr>
+          <w:p>
+            <w:r>
+              <w:t>13.171 x 9.250 in / 13.273 x 9.250 in</w:t>
+            </w:r>
+          </w:p>
+        </w:tc>
+        <w:tc>
+          <w:tcPr>
+            <w:tcW w:type="dxa" w:w="1694"/>
+          </w:tcPr>
+          <w:p>
+            <w:r>
+              <w:t>13.308 x 9.250 in / 13.425 x 9.250 in</w:t>
             </w:r>
           </w:p>
         </w:tc>
@@ -282,99 +205,61 @@
       <w:tr>
         <w:tc>
           <w:tcPr>
-            <w:tcW w:type="dxa" w:w="1080"/>
-            <w:tcMar>
-              <w:top w:w="80" w:type="dxa"/>
-              <w:start w:w="120" w:type="dxa"/>
-              <w:bottom w:w="80" w:type="dxa"/>
-              <w:end w:w="120" w:type="dxa"/>
-            </w:tcMar>
-            <w:vAlign w:val="center"/>
+            <w:tcW w:type="dxa" w:w="1694"/>
           </w:tcPr>
           <w:p>
             <w:r>
-              <w:rPr>
-                <w:rFonts w:ascii="Calibri" w:hAnsi="Calibri"/>
-                <w:b w:val="0"/>
-                <w:color w:val="111827"/>
-              </w:rPr>
-              <w:t>Vol. 2</w:t>
+              <w:t>Volume 2</w:t>
             </w:r>
           </w:p>
         </w:tc>
         <w:tc>
           <w:tcPr>
-            <w:tcW w:type="dxa" w:w="2664"/>
-            <w:tcMar>
-              <w:top w:w="80" w:type="dxa"/>
-              <w:start w:w="120" w:type="dxa"/>
-              <w:bottom w:w="80" w:type="dxa"/>
-              <w:end w:w="120" w:type="dxa"/>
-            </w:tcMar>
-            <w:vAlign w:val="center"/>
+            <w:tcW w:type="dxa" w:w="1694"/>
           </w:tcPr>
           <w:p>
             <w:r>
-              <w:rPr>
-                <w:rFonts w:ascii="Calibri" w:hAnsi="Calibri"/>
-                <w:b w:val="0"/>
-                <w:color w:val="111827"/>
-              </w:rPr>
               <w:t>Walking with Jesus</w:t>
             </w:r>
           </w:p>
         </w:tc>
         <w:tc>
           <w:tcPr>
-            <w:tcW w:type="dxa" w:w="2880"/>
-            <w:tcMar>
-              <w:top w:w="80" w:type="dxa"/>
-              <w:start w:w="120" w:type="dxa"/>
-              <w:bottom w:w="80" w:type="dxa"/>
-              <w:end w:w="120" w:type="dxa"/>
-            </w:tcMar>
-            <w:vAlign w:val="center"/>
+            <w:tcW w:type="dxa" w:w="1694"/>
           </w:tcPr>
           <w:p>
             <w:r>
-              <w:rPr>
-                <w:rFonts w:ascii="Calibri" w:hAnsi="Calibri"/>
-                <w:b w:val="0"/>
-                <w:color w:val="111827"/>
-              </w:rPr>
-              <w:t>350 devotional pages</w:t>
-              <w:br/>
-              <w:t>477 journal pages</w:t>
-              <w:br/>
-              <w:t>98,804 devotional words</w:t>
+              <w:t>350</w:t>
             </w:r>
           </w:p>
         </w:tc>
         <w:tc>
           <w:tcPr>
-            <w:tcW w:type="dxa" w:w="2736"/>
-            <w:tcMar>
-              <w:top w:w="80" w:type="dxa"/>
-              <w:start w:w="120" w:type="dxa"/>
-              <w:bottom w:w="80" w:type="dxa"/>
-              <w:end w:w="120" w:type="dxa"/>
-            </w:tcMar>
-            <w:vAlign w:val="center"/>
+            <w:tcW w:type="dxa" w:w="1694"/>
           </w:tcPr>
           <w:p>
             <w:r>
-              <w:rPr>
-                <w:rFonts w:ascii="Calibri" w:hAnsi="Calibri"/>
-                <w:b w:val="0"/>
-                <w:color w:val="111827"/>
-              </w:rPr>
-              <w:t>Devotional white: 13.038 x 9.250 in</w:t>
-              <w:br/>
-              <w:t>Devotional cream: 13.125 x 9.250 in</w:t>
-              <w:br/>
-              <w:t>Journal white: 13.324 x 9.250 in</w:t>
-              <w:br/>
-              <w:t>Journal cream: 13.443 x 9.250 in</w:t>
+              <w:t>477</w:t>
+            </w:r>
+          </w:p>
+        </w:tc>
+        <w:tc>
+          <w:tcPr>
+            <w:tcW w:type="dxa" w:w="1694"/>
+          </w:tcPr>
+          <w:p>
+            <w:r>
+              <w:t>13.038 x 9.250 in / 13.125 x 9.250 in</w:t>
+            </w:r>
+          </w:p>
+        </w:tc>
+        <w:tc>
+          <w:tcPr>
+            <w:tcW w:type="dxa" w:w="1694"/>
+          </w:tcPr>
+          <w:p>
+            <w:r>
+              <w:t>13.324 x 9.250 in / 13.443 x 9.250 in</w:t>
             </w:r>
           </w:p>
         </w:tc>
@@ -382,99 +267,61 @@
       <w:tr>
         <w:tc>
           <w:tcPr>
-            <w:tcW w:type="dxa" w:w="1080"/>
-            <w:tcMar>
-              <w:top w:w="80" w:type="dxa"/>
-              <w:start w:w="120" w:type="dxa"/>
-              <w:bottom w:w="80" w:type="dxa"/>
-              <w:end w:w="120" w:type="dxa"/>
-            </w:tcMar>
-            <w:vAlign w:val="center"/>
+            <w:tcW w:type="dxa" w:w="1694"/>
           </w:tcPr>
           <w:p>
             <w:r>
-              <w:rPr>
-                <w:rFonts w:ascii="Calibri" w:hAnsi="Calibri"/>
-                <w:b w:val="0"/>
-                <w:color w:val="111827"/>
-              </w:rPr>
-              <w:t>Vol. 3</w:t>
+              <w:t>Volume 3</w:t>
             </w:r>
           </w:p>
         </w:tc>
         <w:tc>
           <w:tcPr>
-            <w:tcW w:type="dxa" w:w="2664"/>
-            <w:tcMar>
-              <w:top w:w="80" w:type="dxa"/>
-              <w:start w:w="120" w:type="dxa"/>
-              <w:bottom w:w="80" w:type="dxa"/>
-              <w:end w:w="120" w:type="dxa"/>
-            </w:tcMar>
-            <w:vAlign w:val="center"/>
+            <w:tcW w:type="dxa" w:w="1694"/>
           </w:tcPr>
           <w:p>
             <w:r>
-              <w:rPr>
-                <w:rFonts w:ascii="Calibri" w:hAnsi="Calibri"/>
-                <w:b w:val="0"/>
-                <w:color w:val="111827"/>
-              </w:rPr>
               <w:t>Filled with the Holy Spirit</w:t>
             </w:r>
           </w:p>
         </w:tc>
         <w:tc>
           <w:tcPr>
-            <w:tcW w:type="dxa" w:w="2880"/>
-            <w:tcMar>
-              <w:top w:w="80" w:type="dxa"/>
-              <w:start w:w="120" w:type="dxa"/>
-              <w:bottom w:w="80" w:type="dxa"/>
-              <w:end w:w="120" w:type="dxa"/>
-            </w:tcMar>
-            <w:vAlign w:val="center"/>
+            <w:tcW w:type="dxa" w:w="1694"/>
           </w:tcPr>
           <w:p>
             <w:r>
-              <w:rPr>
-                <w:rFonts w:ascii="Calibri" w:hAnsi="Calibri"/>
-                <w:b w:val="0"/>
-                <w:color w:val="111827"/>
-              </w:rPr>
-              <w:t>339 devotional pages</w:t>
-              <w:br/>
-              <w:t>483 journal pages</w:t>
-              <w:br/>
-              <w:t>95,247 devotional words</w:t>
+              <w:t>339</w:t>
             </w:r>
           </w:p>
         </w:tc>
         <w:tc>
           <w:tcPr>
-            <w:tcW w:type="dxa" w:w="2736"/>
-            <w:tcMar>
-              <w:top w:w="80" w:type="dxa"/>
-              <w:start w:w="120" w:type="dxa"/>
-              <w:bottom w:w="80" w:type="dxa"/>
-              <w:end w:w="120" w:type="dxa"/>
-            </w:tcMar>
-            <w:vAlign w:val="center"/>
+            <w:tcW w:type="dxa" w:w="1694"/>
           </w:tcPr>
           <w:p>
             <w:r>
-              <w:rPr>
-                <w:rFonts w:ascii="Calibri" w:hAnsi="Calibri"/>
-                <w:b w:val="0"/>
-                <w:color w:val="111827"/>
-              </w:rPr>
-              <w:t>Devotional white: 13.013 x 9.250 in</w:t>
-              <w:br/>
-              <w:t>Devotional cream: 13.098 x 9.250 in</w:t>
-              <w:br/>
-              <w:t>Journal white: 13.338 x 9.250 in</w:t>
-              <w:br/>
-              <w:t>Journal cream: 13.457 x 9.250 in</w:t>
+              <w:t>483</w:t>
+            </w:r>
+          </w:p>
+        </w:tc>
+        <w:tc>
+          <w:tcPr>
+            <w:tcW w:type="dxa" w:w="1694"/>
+          </w:tcPr>
+          <w:p>
+            <w:r>
+              <w:t>13.013 x 9.250 in / 13.098 x 9.250 in</w:t>
+            </w:r>
+          </w:p>
+        </w:tc>
+        <w:tc>
+          <w:tcPr>
+            <w:tcW w:type="dxa" w:w="1694"/>
+          </w:tcPr>
+          <w:p>
+            <w:r>
+              <w:t>13.338 x 9.250 in / 13.457 x 9.250 in</w:t>
             </w:r>
           </w:p>
         </w:tc>
@@ -491,28 +338,30 @@
     <w:p>
       <w:pPr>
         <w:pStyle w:val="ListBullet"/>
-        <w:spacing w:after="80" w:line="300" w:lineRule="auto"/>
-        <w:ind w:left="540" w:hanging="271"/>
       </w:pPr>
       <w:r>
-        <w:t>1,098 devotional day cards across the three volumes.</w:t>
+        <w:t>1,098 day cards across the three volumes.</w:t>
       </w:r>
     </w:p>
     <w:p>
       <w:pPr>
         <w:pStyle w:val="ListBullet"/>
-        <w:spacing w:after="80" w:line="300" w:lineRule="auto"/>
-        <w:ind w:left="540" w:hanging="271"/>
       </w:pPr>
       <w:r>
-        <w:t>Three master manuscripts and three companion journals in Markdown, DOCX, and PDF.</w:t>
+        <w:t>Three master interior manuscripts in Markdown, DOCX, and PDF.</w:t>
       </w:r>
     </w:p>
     <w:p>
       <w:pPr>
         <w:pStyle w:val="ListBullet"/>
-        <w:spacing w:after="80" w:line="300" w:lineRule="auto"/>
-        <w:ind w:left="540" w:hanging="271"/>
+      </w:pPr>
+      <w:r>
+        <w:t>Three master companion journals in Markdown, DOCX, and PDF.</w:t>
+      </w:r>
+    </w:p>
+    <w:p>
+      <w:pPr>
+        <w:pStyle w:val="ListBullet"/>
       </w:pPr>
       <w:r>
         <w:t>Master assembly audit result: pass.</w:t>
@@ -521,81 +370,153 @@
     <w:p>
       <w:pPr>
         <w:pStyle w:val="ListBullet"/>
-        <w:spacing w:after="80" w:line="300" w:lineRule="auto"/>
-        <w:ind w:left="540" w:hanging="271"/>
       </w:pPr>
       <w:r>
-        <w:t>Sabbath guardrail preserved with zero Sunday mentions in master artifacts.</w:t>
+        <w:t>Sabbath guardrail preserved: Sunday mentions remain zero in master manuscripts and journals.</w:t>
       </w:r>
     </w:p>
     <w:p>
       <w:pPr>
         <w:pStyle w:val="ListBullet"/>
-        <w:spacing w:after="80" w:line="300" w:lineRule="auto"/>
-        <w:ind w:left="540" w:hanging="271"/>
       </w:pPr>
       <w:r>
-        <w:t>Nine 6 x 9 front-cover candidates and first-pass Path-route full-wrap drafts.</w:t>
+        <w:t>Nine 6 x 9 front-cover art candidates.</w:t>
       </w:r>
     </w:p>
     <w:p>
       <w:pPr>
         <w:pStyle w:val="ListBullet"/>
-        <w:spacing w:after="80" w:line="300" w:lineRule="auto"/>
-        <w:ind w:left="540" w:hanging="271"/>
       </w:pPr>
       <w:r>
-        <w:t>Path-route full-wrap draft covers generated for the three companion journals.</w:t>
+        <w:t>Path-route full-wrap draft pack for the three main manuscripts.</w:t>
       </w:r>
     </w:p>
     <w:p>
       <w:pPr>
         <w:pStyle w:val="ListBullet"/>
-        <w:spacing w:after="80" w:line="300" w:lineRule="auto"/>
-        <w:ind w:left="540" w:hanging="271"/>
       </w:pPr>
       <w:r>
-        <w:t>KDP trim and cover readiness worksheet generated from current official KDP guidance.</w:t>
+        <w:t>Path-route full-wrap draft pack for the three companion journals.</w:t>
       </w:r>
     </w:p>
     <w:p>
       <w:pPr>
         <w:pStyle w:val="ListBullet"/>
-        <w:spacing w:after="80" w:line="300" w:lineRule="auto"/>
-        <w:ind w:left="540" w:hanging="271"/>
       </w:pPr>
       <w:r>
-        <w:t>Volume 1 6 x 9 interior prototype package generated for the first seven devotional entries.</w:t>
+        <w:t>KDP trim and cover readiness worksheet.</w:t>
       </w:r>
     </w:p>
     <w:p>
       <w:pPr>
         <w:pStyle w:val="ListBullet"/>
-        <w:spacing w:after="80" w:line="300" w:lineRule="auto"/>
-        <w:ind w:left="540" w:hanging="271"/>
       </w:pPr>
       <w:r>
-        <w:t>Full 6 x 9 interior review drafts generated for Volumes 1, 2, and 3 with 366 entries each.</w:t>
+        <w:t>Volume 1 6 x 9 interior prototype package for the first seven devotional entries.</w:t>
       </w:r>
     </w:p>
     <w:p>
       <w:pPr>
         <w:pStyle w:val="ListBullet"/>
-        <w:spacing w:after="80" w:line="300" w:lineRule="auto"/>
-        <w:ind w:left="540" w:hanging="271"/>
       </w:pPr>
       <w:r>
-        <w:t>Full 6 x 9 companion journal review drafts generated for Volumes 1, 2, and 3.</w:t>
+        <w:t>Full 6 x 9 interior review drafts for Volumes 1, 2, and 3 with 366 entries each.</w:t>
       </w:r>
     </w:p>
     <w:p>
       <w:pPr>
         <w:pStyle w:val="ListBullet"/>
-        <w:spacing w:after="80" w:line="300" w:lineRule="auto"/>
-        <w:ind w:left="540" w:hanging="271"/>
+      </w:pPr>
+      <w:r>
+        <w:t>Full 6 x 9 companion journal review drafts for Volumes 1, 2, and 3 with 365 daily pages plus one February 29 bonus page each.</w:t>
+      </w:r>
+    </w:p>
+    <w:p>
+      <w:pPr>
+        <w:pStyle w:val="ListBullet"/>
+      </w:pPr>
+      <w:r>
+        <w:t>Release upload readiness pack with six KDP metadata sheets, permissions policy, proof runbook, and theological-production audit.</w:t>
+      </w:r>
+    </w:p>
+    <w:p>
+      <w:pPr>
+        <w:pStyle w:val="ListBullet"/>
       </w:pPr>
       <w:r>
         <w:t>Public Vercel review page for author-facing review.</w:t>
+      </w:r>
+    </w:p>
+    <w:p>
+      <w:pPr>
+        <w:pStyle w:val="Heading1"/>
+      </w:pPr>
+      <w:r>
+        <w:t>Interior Finalization Deliverables In This Kit</w:t>
+      </w:r>
+    </w:p>
+    <w:p>
+      <w:pPr>
+        <w:pStyle w:val="ListBullet"/>
+      </w:pPr>
+      <w:r>
+        <w:t>Volume 1: front-back-matter-template-volume-1.md</w:t>
+      </w:r>
+    </w:p>
+    <w:p>
+      <w:pPr>
+        <w:pStyle w:val="ListBullet"/>
+      </w:pPr>
+      <w:r>
+        <w:t>Volume 2: front-back-matter-template-volume-2.md</w:t>
+      </w:r>
+    </w:p>
+    <w:p>
+      <w:pPr>
+        <w:pStyle w:val="ListBullet"/>
+      </w:pPr>
+      <w:r>
+        <w:t>Volume 3: front-back-matter-template-volume-3.md</w:t>
+      </w:r>
+    </w:p>
+    <w:p>
+      <w:pPr>
+        <w:pStyle w:val="ListBullet"/>
+      </w:pPr>
+      <w:r>
+        <w:t>lady-d-kdp-interior-finalization-kit.md</w:t>
+      </w:r>
+    </w:p>
+    <w:p>
+      <w:pPr>
+        <w:pStyle w:val="ListBullet"/>
+      </w:pPr>
+      <w:r>
+        <w:t>lady-d-kdp-interior-finalization-kit.docx</w:t>
+      </w:r>
+    </w:p>
+    <w:p>
+      <w:pPr>
+        <w:pStyle w:val="ListBullet"/>
+      </w:pPr>
+      <w:r>
+        <w:t>lady-d-kdp-interior-finalization-kit.pdf</w:t>
+      </w:r>
+    </w:p>
+    <w:p>
+      <w:pPr>
+        <w:pStyle w:val="ListBullet"/>
+      </w:pPr>
+      <w:r>
+        <w:t>lady-d-release-readiness-dashboard.html</w:t>
+      </w:r>
+    </w:p>
+    <w:p>
+      <w:pPr>
+        <w:pStyle w:val="ListBullet"/>
+      </w:pPr>
+      <w:r>
+        <w:t>Lady-D-KDP-Interior-Finalization-Kit.zip</w:t>
       </w:r>
     </w:p>
     <w:p>
@@ -607,113 +528,63 @@
       </w:r>
     </w:p>
     <w:p>
-      <w:pPr>
-        <w:pStyle w:val="ListNumber"/>
-        <w:spacing w:after="80" w:line="300" w:lineRule="auto"/>
-        <w:ind w:left="540" w:hanging="271"/>
-      </w:pPr>
       <w:r>
-        <w:t>Half-title page.</w:t>
+        <w:t>Use this order unless the author or publisher makes a deliberate change:</w:t>
       </w:r>
     </w:p>
     <w:p>
-      <w:pPr>
-        <w:pStyle w:val="ListNumber"/>
-        <w:spacing w:after="80" w:line="300" w:lineRule="auto"/>
-        <w:ind w:left="540" w:hanging="271"/>
-      </w:pPr>
       <w:r>
-        <w:t>Series page.</w:t>
+        <w:t>1. Half-title page.</w:t>
       </w:r>
     </w:p>
     <w:p>
-      <w:pPr>
-        <w:pStyle w:val="ListNumber"/>
-        <w:spacing w:after="80" w:line="300" w:lineRule="auto"/>
-        <w:ind w:left="540" w:hanging="271"/>
-      </w:pPr>
       <w:r>
-        <w:t>Title page.</w:t>
+        <w:t>2. Series page.</w:t>
       </w:r>
     </w:p>
     <w:p>
-      <w:pPr>
-        <w:pStyle w:val="ListNumber"/>
-        <w:spacing w:after="80" w:line="300" w:lineRule="auto"/>
-        <w:ind w:left="540" w:hanging="271"/>
-      </w:pPr>
       <w:r>
-        <w:t>Copyright page.</w:t>
+        <w:t>3. Title page.</w:t>
       </w:r>
     </w:p>
     <w:p>
-      <w:pPr>
-        <w:pStyle w:val="ListNumber"/>
-        <w:spacing w:after="80" w:line="300" w:lineRule="auto"/>
-        <w:ind w:left="540" w:hanging="271"/>
-      </w:pPr>
       <w:r>
-        <w:t>Dedication.</w:t>
+        <w:t>4. Copyright page.</w:t>
       </w:r>
     </w:p>
     <w:p>
-      <w:pPr>
-        <w:pStyle w:val="ListNumber"/>
-        <w:spacing w:after="80" w:line="300" w:lineRule="auto"/>
-        <w:ind w:left="540" w:hanging="271"/>
-      </w:pPr>
       <w:r>
-        <w:t>Author welcome.</w:t>
+        <w:t>5. Dedication.</w:t>
       </w:r>
     </w:p>
     <w:p>
-      <w:pPr>
-        <w:pStyle w:val="ListNumber"/>
-        <w:spacing w:after="80" w:line="300" w:lineRule="auto"/>
-        <w:ind w:left="540" w:hanging="271"/>
-      </w:pPr>
       <w:r>
-        <w:t>How to use this devotional.</w:t>
+        <w:t>6. Author welcome.</w:t>
       </w:r>
     </w:p>
     <w:p>
-      <w:pPr>
-        <w:pStyle w:val="ListNumber"/>
-        <w:spacing w:after="80" w:line="300" w:lineRule="auto"/>
-        <w:ind w:left="540" w:hanging="271"/>
-      </w:pPr>
       <w:r>
-        <w:t>Scripture and permissions note.</w:t>
+        <w:t>7. How to use this devotional.</w:t>
       </w:r>
     </w:p>
     <w:p>
-      <w:pPr>
-        <w:pStyle w:val="ListNumber"/>
-        <w:spacing w:after="80" w:line="300" w:lineRule="auto"/>
-        <w:ind w:left="540" w:hanging="271"/>
-      </w:pPr>
       <w:r>
-        <w:t>Sabbath and grace framing note.</w:t>
+        <w:t>8. Scripture and permissions note.</w:t>
       </w:r>
     </w:p>
     <w:p>
-      <w:pPr>
-        <w:pStyle w:val="ListNumber"/>
-        <w:spacing w:after="80" w:line="300" w:lineRule="auto"/>
-        <w:ind w:left="540" w:hanging="271"/>
-      </w:pPr>
       <w:r>
-        <w:t>Reader orientation.</w:t>
+        <w:t>9. Sabbath and grace framing note.</w:t>
       </w:r>
     </w:p>
     <w:p>
-      <w:pPr>
-        <w:pStyle w:val="ListNumber"/>
-        <w:spacing w:after="80" w:line="300" w:lineRule="auto"/>
-        <w:ind w:left="540" w:hanging="271"/>
-      </w:pPr>
       <w:r>
-        <w:t>January 1 devotional entry.</w:t>
+        <w:t>10. Reader orientation.</w:t>
+      </w:r>
+    </w:p>
+    <w:p>
+      <w:r>
+        <w:t>11. January 1 devotional entry.</w:t>
       </w:r>
     </w:p>
     <w:p>
@@ -725,73 +596,38 @@
       </w:r>
     </w:p>
     <w:p>
-      <w:pPr>
-        <w:pStyle w:val="ListNumber"/>
-        <w:spacing w:after="80" w:line="300" w:lineRule="auto"/>
-        <w:ind w:left="540" w:hanging="271"/>
-      </w:pPr>
       <w:r>
-        <w:t>Closing year-end reflection.</w:t>
+        <w:t>1. Closing year-end reflection.</w:t>
       </w:r>
     </w:p>
     <w:p>
-      <w:pPr>
-        <w:pStyle w:val="ListNumber"/>
-        <w:spacing w:after="80" w:line="300" w:lineRule="auto"/>
-        <w:ind w:left="540" w:hanging="271"/>
-      </w:pPr>
       <w:r>
-        <w:t>Companion journal invitation.</w:t>
+        <w:t>2. Companion journal invitation.</w:t>
       </w:r>
     </w:p>
     <w:p>
-      <w:pPr>
-        <w:pStyle w:val="ListNumber"/>
-        <w:spacing w:after="80" w:line="300" w:lineRule="auto"/>
-        <w:ind w:left="540" w:hanging="271"/>
-      </w:pPr>
       <w:r>
-        <w:t>Prayer of surrender for the next season.</w:t>
+        <w:t>3. Prayer of surrender for the next season.</w:t>
       </w:r>
     </w:p>
     <w:p>
-      <w:pPr>
-        <w:pStyle w:val="ListNumber"/>
-        <w:spacing w:after="80" w:line="300" w:lineRule="auto"/>
-        <w:ind w:left="540" w:hanging="271"/>
-      </w:pPr>
       <w:r>
-        <w:t>About Susan "Lady D" Damon.</w:t>
+        <w:t>4. About Susan "Lady D" Damon.</w:t>
       </w:r>
     </w:p>
     <w:p>
-      <w:pPr>
-        <w:pStyle w:val="ListNumber"/>
-        <w:spacing w:after="80" w:line="300" w:lineRule="auto"/>
-        <w:ind w:left="540" w:hanging="271"/>
-      </w:pPr>
       <w:r>
-        <w:t>About IDC Publishing.</w:t>
+        <w:t>5. About IDC Publishing.</w:t>
       </w:r>
     </w:p>
     <w:p>
-      <w:pPr>
-        <w:pStyle w:val="ListNumber"/>
-        <w:spacing w:after="80" w:line="300" w:lineRule="auto"/>
-        <w:ind w:left="540" w:hanging="271"/>
-      </w:pPr>
       <w:r>
-        <w:t>Other volumes in the Lady D Devotional Library.</w:t>
+        <w:t>6. Other volumes in the Lady D Devotional Library.</w:t>
       </w:r>
     </w:p>
     <w:p>
-      <w:pPr>
-        <w:pStyle w:val="ListNumber"/>
-        <w:spacing w:after="80" w:line="300" w:lineRule="auto"/>
-        <w:ind w:left="540" w:hanging="271"/>
-      </w:pPr>
       <w:r>
-        <w:t>Acknowledgments.</w:t>
+        <w:t>7. Acknowledgments.</w:t>
       </w:r>
     </w:p>
     <w:p>
@@ -803,33 +639,23 @@
       </w:r>
     </w:p>
     <w:p>
-      <w:pPr>
-        <w:pStyle w:val="ListBullet"/>
-        <w:spacing w:after="80" w:line="300" w:lineRule="auto"/>
-        <w:ind w:left="540" w:hanging="271"/>
-      </w:pPr>
       <w:r>
-        <w:t>Keep references only and avoid full Bible quotation text.</w:t>
+        <w:t>The current manuscripts include Scripture references, not full Bible quotation text. Before KDP upload, choose one of these paths:</w:t>
       </w:r>
     </w:p>
     <w:p>
-      <w:pPr>
-        <w:pStyle w:val="ListBullet"/>
-        <w:spacing w:after="80" w:line="300" w:lineRule="auto"/>
-        <w:ind w:left="540" w:hanging="271"/>
-      </w:pPr>
       <w:r>
-        <w:t>Or add full Scripture text only after selecting a translation and inserting its required copyright and permission notice.</w:t>
+        <w:t>1. Keep references only and avoid adding Bible quotation text.</w:t>
       </w:r>
     </w:p>
     <w:p>
-      <w:pPr>
-        <w:pStyle w:val="ListBullet"/>
-        <w:spacing w:after="80" w:line="300" w:lineRule="auto"/>
-        <w:ind w:left="540" w:hanging="271"/>
-      </w:pPr>
       <w:r>
-        <w:t>If using public-domain text, disclose the translation/source clearly and consistently.</w:t>
+        <w:t>2. Add full Scripture text only after selecting a translation and inserting its required copyright and permission notice.</w:t>
+      </w:r>
+    </w:p>
+    <w:p>
+      <w:r>
+        <w:t>3. If using public-domain text, still disclose the translation/source clearly and consistently.</w:t>
       </w:r>
     </w:p>
     <w:p>
@@ -854,73 +680,43 @@
       </w:r>
     </w:p>
     <w:p>
-      <w:pPr>
-        <w:pStyle w:val="ListNumber"/>
-        <w:spacing w:after="80" w:line="300" w:lineRule="auto"/>
-        <w:ind w:left="540" w:hanging="271"/>
-      </w:pPr>
       <w:r>
-        <w:t>Editorial judge: reader clarity, voice, flow, and author-heart fit.</w:t>
+        <w:t>Run three to seven passes depending on risk:</w:t>
       </w:r>
     </w:p>
     <w:p>
-      <w:pPr>
-        <w:pStyle w:val="ListNumber"/>
-        <w:spacing w:after="80" w:line="300" w:lineRule="auto"/>
-        <w:ind w:left="540" w:hanging="271"/>
-      </w:pPr>
       <w:r>
-        <w:t>Theological auditor: Sabbath frame, grace/obedience frame, Jesus-centered Spirit language.</w:t>
+        <w:t>1. Editorial judge: reader clarity, voice, flow, and author-heart fit.</w:t>
       </w:r>
     </w:p>
     <w:p>
-      <w:pPr>
-        <w:pStyle w:val="ListNumber"/>
-        <w:spacing w:after="80" w:line="300" w:lineRule="auto"/>
-        <w:ind w:left="540" w:hanging="271"/>
-      </w:pPr>
       <w:r>
-        <w:t>Permissions auditor: Bible references/quotations, copyright notice, ISBN/imprint data.</w:t>
+        <w:t>2. Theological auditor: Sabbath frame, grace/obedience frame, Jesus-centered Spirit language.</w:t>
       </w:r>
     </w:p>
     <w:p>
-      <w:pPr>
-        <w:pStyle w:val="ListNumber"/>
-        <w:spacing w:after="80" w:line="300" w:lineRule="auto"/>
-        <w:ind w:left="540" w:hanging="271"/>
-      </w:pPr>
       <w:r>
-        <w:t>Production auditor: 6 x 9 margins, page count, running heads, page numbers, image resolution.</w:t>
+        <w:t>3. Permissions auditor: Bible references/quotations, copyright notice, ISBN/imprint data.</w:t>
       </w:r>
     </w:p>
     <w:p>
-      <w:pPr>
-        <w:pStyle w:val="ListNumber"/>
-        <w:spacing w:after="80" w:line="300" w:lineRule="auto"/>
-        <w:ind w:left="540" w:hanging="271"/>
-      </w:pPr>
       <w:r>
-        <w:t>Retail judge: cover thumbnail readability, Amazon metadata, description, categories, and series cohesion.</w:t>
+        <w:t>4. Production auditor: 6 x 9 margins, page count, running heads, page numbers, image resolution.</w:t>
       </w:r>
     </w:p>
     <w:p>
-      <w:pPr>
-        <w:pStyle w:val="ListNumber"/>
-        <w:spacing w:after="80" w:line="300" w:lineRule="auto"/>
-        <w:ind w:left="540" w:hanging="271"/>
-      </w:pPr>
       <w:r>
-        <w:t>Proof auditor: KDP Previewer, printed proof, spine alignment, trim, bleed, and barcode area.</w:t>
+        <w:t>5. Retail judge: cover thumbnail readability, Amazon metadata, description, categories, and series cohesion.</w:t>
       </w:r>
     </w:p>
     <w:p>
-      <w:pPr>
-        <w:pStyle w:val="ListNumber"/>
-        <w:spacing w:after="80" w:line="300" w:lineRule="auto"/>
-        <w:ind w:left="540" w:hanging="271"/>
-      </w:pPr>
       <w:r>
-        <w:t>Final release judge: all blockers closed and no placeholder text remains.</w:t>
+        <w:t>6. Proof auditor: KDP Previewer, printed proof, spine alignment, trim, bleed, and barcode area.</w:t>
+      </w:r>
+    </w:p>
+    <w:p>
+      <w:r>
+        <w:t>7. Final release judge: all blockers closed and no placeholder text remains.</w:t>
       </w:r>
     </w:p>
     <w:p>
@@ -934,8 +730,6 @@
     <w:p>
       <w:pPr>
         <w:pStyle w:val="ListBullet"/>
-        <w:spacing w:after="80" w:line="300" w:lineRule="auto"/>
-        <w:ind w:left="540" w:hanging="271"/>
       </w:pPr>
       <w:r>
         <w:t>Final paper type and trim choices.</w:t>
@@ -944,8 +738,6 @@
     <w:p>
       <w:pPr>
         <w:pStyle w:val="ListBullet"/>
-        <w:spacing w:after="80" w:line="300" w:lineRule="auto"/>
-        <w:ind w:left="540" w:hanging="271"/>
       </w:pPr>
       <w:r>
         <w:t>Final front matter and back matter approval.</w:t>
@@ -954,8 +746,6 @@
     <w:p>
       <w:pPr>
         <w:pStyle w:val="ListBullet"/>
-        <w:spacing w:after="80" w:line="300" w:lineRule="auto"/>
-        <w:ind w:left="540" w:hanging="271"/>
       </w:pPr>
       <w:r>
         <w:t>Final author bio, dedication, acknowledgments, and ISBN.</w:t>
@@ -964,8 +754,6 @@
     <w:p>
       <w:pPr>
         <w:pStyle w:val="ListBullet"/>
-        <w:spacing w:after="80" w:line="300" w:lineRule="auto"/>
-        <w:ind w:left="540" w:hanging="271"/>
       </w:pPr>
       <w:r>
         <w:t>Final Bible permissions statement.</w:t>
@@ -974,8 +762,6 @@
     <w:p>
       <w:pPr>
         <w:pStyle w:val="ListBullet"/>
-        <w:spacing w:after="80" w:line="300" w:lineRule="auto"/>
-        <w:ind w:left="540" w:hanging="271"/>
       </w:pPr>
       <w:r>
         <w:t>Final copyedit of all three manuscripts and journals.</w:t>
@@ -984,18 +770,14 @@
     <w:p>
       <w:pPr>
         <w:pStyle w:val="ListBullet"/>
-        <w:spacing w:after="80" w:line="300" w:lineRule="auto"/>
-        <w:ind w:left="540" w:hanging="271"/>
       </w:pPr>
       <w:r>
-        <w:t>Final approved 6 x 9 devotional and journal upload interiors with locked page counts.</w:t>
+        <w:t>Final approved 6 x 9 upload interiors with locked page counts.</w:t>
       </w:r>
     </w:p>
     <w:p>
       <w:pPr>
         <w:pStyle w:val="ListBullet"/>
-        <w:spacing w:after="80" w:line="300" w:lineRule="auto"/>
-        <w:ind w:left="540" w:hanging="271"/>
       </w:pPr>
       <w:r>
         <w:t>Regenerated full-wrap covers from final page counts.</w:t>
@@ -1004,8 +786,14 @@
     <w:p>
       <w:pPr>
         <w:pStyle w:val="ListBullet"/>
-        <w:spacing w:after="80" w:line="300" w:lineRule="auto"/>
-        <w:ind w:left="540" w:hanging="271"/>
+      </w:pPr>
+      <w:r>
+        <w:t>Final KDP metadata approval for all three devotionals and all three companion journals.</w:t>
+      </w:r>
+    </w:p>
+    <w:p>
+      <w:pPr>
+        <w:pStyle w:val="ListBullet"/>
       </w:pPr>
       <w:r>
         <w:t>KDP Previewer pass for each upload file.</w:t>
@@ -1014,8 +802,6 @@
     <w:p>
       <w:pPr>
         <w:pStyle w:val="ListBullet"/>
-        <w:spacing w:after="80" w:line="300" w:lineRule="auto"/>
-        <w:ind w:left="540" w:hanging="271"/>
       </w:pPr>
       <w:r>
         <w:t>Physical proof review before public release.</w:t>
@@ -1031,32 +817,17 @@
     </w:p>
     <w:p>
       <w:r>
-        <w:t>Use the devotional and companion journal 6 x 9 review drafts as the next trilogy-wide copyedit and theological proof surface. Once each volume and journal is approved, regenerate the full-wrap covers from the locked page counts and paper type.</w:t>
+        <w:t>Use the devotional and companion journal 6 x 9 review drafts plus the release upload readiness pack as the next trilogy-wide copyedit and theological proof surface. Once each volume and journal is approved, finalize metadata, then regenerate the full-wrap covers from the locked page counts and paper type.</w:t>
       </w:r>
     </w:p>
     <w:sectPr>
-      <w:footerReference w:type="default" r:id="rId9"/>
       <w:pgSz w:w="12240" w:h="15840"/>
-      <w:pgMar w:top="1440" w:right="1440" w:bottom="1440" w:left="1440" w:header="708" w:footer="708" w:gutter="0"/>
+      <w:pgMar w:top="1008" w:right="1037" w:bottom="1008" w:left="1037" w:header="720" w:footer="720" w:gutter="0"/>
       <w:cols w:space="720"/>
       <w:docGrid w:linePitch="360"/>
     </w:sectPr>
   </w:body>
 </w:document>
-</file>
-
-<file path=word/footer1.xml><?xml version="1.0" encoding="utf-8"?>
-<w:ftr xmlns:m="http://schemas.openxmlformats.org/officeDocument/2006/math" xmlns:mc="http://schemas.openxmlformats.org/markup-compatibility/2006" xmlns:mo="http://schemas.microsoft.com/office/mac/office/2008/main" xmlns:mv="urn:schemas-microsoft-com:mac:vml" xmlns:o="urn:schemas-microsoft-com:office:office" xmlns:r="http://schemas.openxmlformats.org/officeDocument/2006/relationships" xmlns:v="urn:schemas-microsoft-com:vml" xmlns:w10="urn:schemas-microsoft-com:office:word" xmlns:w14="http://schemas.microsoft.com/office/word/2010/wordml" xmlns:w="http://schemas.openxmlformats.org/wordprocessingml/2006/main" xmlns:wne="http://schemas.microsoft.com/office/word/2006/wordml" xmlns:wp14="http://schemas.microsoft.com/office/word/2010/wordprocessingDrawing" xmlns:wp="http://schemas.openxmlformats.org/drawingml/2006/wordprocessingDrawing" xmlns:wpc="http://schemas.microsoft.com/office/word/2010/wordprocessingCanvas" xmlns:wpg="http://schemas.microsoft.com/office/word/2010/wordprocessingGroup" xmlns:wpi="http://schemas.microsoft.com/office/word/2010/wordprocessingInk" xmlns:wps="http://schemas.microsoft.com/office/word/2010/wordprocessingShape" mc:Ignorable="w14 wp14">
-  <w:p>
-    <w:pPr>
-      <w:pStyle w:val="Footer"/>
-      <w:jc w:val="center"/>
-    </w:pPr>
-    <w:r>
-      <w:t>Lady D KDP Interior Finalization Kit</w:t>
-    </w:r>
-  </w:p>
-</w:ftr>
 </file>
 
 <file path=word/numbering.xml><?xml version="1.0" encoding="utf-8"?>
@@ -1422,13 +1193,9 @@
     <w:name w:val="Normal"/>
     <w:qFormat/>
     <w:rsid w:val="00FC693F"/>
-    <w:pPr>
-      <w:spacing w:after="120" w:line="300" w:lineRule="auto"/>
-    </w:pPr>
     <w:rPr>
       <w:rFonts w:ascii="Calibri" w:hAnsi="Calibri"/>
-      <w:color w:val="111827"/>
-      <w:sz w:val="22"/>
+      <w:sz w:val="21"/>
     </w:rPr>
   </w:style>
   <w:style w:type="paragraph" w:styleId="Header">
@@ -1486,15 +1253,15 @@
     <w:pPr>
       <w:keepNext/>
       <w:keepLines/>
-      <w:spacing w:before="360" w:after="200" w:line="300" w:lineRule="auto"/>
+      <w:spacing w:before="480" w:after="0"/>
       <w:outlineLvl w:val="0"/>
     </w:pPr>
     <w:rPr>
-      <w:rFonts w:asciiTheme="majorHAnsi" w:eastAsiaTheme="majorEastAsia" w:hAnsiTheme="majorHAnsi" w:cstheme="majorBidi" w:ascii="Calibri" w:hAnsi="Calibri"/>
+      <w:rFonts w:asciiTheme="majorHAnsi" w:eastAsiaTheme="majorEastAsia" w:hAnsiTheme="majorHAnsi" w:cstheme="majorBidi" w:ascii="Georgia" w:hAnsi="Georgia"/>
       <w:b/>
       <w:bCs/>
-      <w:color w:val="2E74B5"/>
-      <w:sz w:val="32"/>
+      <w:color w:val="182646"/>
+      <w:sz w:val="36"/>
       <w:szCs w:val="28"/>
     </w:rPr>
   </w:style>
@@ -1510,15 +1277,15 @@
     <w:pPr>
       <w:keepNext/>
       <w:keepLines/>
-      <w:spacing w:before="280" w:after="140" w:line="300" w:lineRule="auto"/>
+      <w:spacing w:before="200" w:after="0"/>
       <w:outlineLvl w:val="1"/>
     </w:pPr>
     <w:rPr>
-      <w:rFonts w:asciiTheme="majorHAnsi" w:eastAsiaTheme="majorEastAsia" w:hAnsiTheme="majorHAnsi" w:cstheme="majorBidi" w:ascii="Calibri" w:hAnsi="Calibri"/>
+      <w:rFonts w:asciiTheme="majorHAnsi" w:eastAsiaTheme="majorEastAsia" w:hAnsiTheme="majorHAnsi" w:cstheme="majorBidi" w:ascii="Georgia" w:hAnsi="Georgia"/>
       <w:b/>
       <w:bCs/>
-      <w:color w:val="2E74B5"/>
-      <w:sz w:val="26"/>
+      <w:color w:val="182646"/>
+      <w:sz w:val="28"/>
       <w:szCs w:val="26"/>
     </w:rPr>
   </w:style>
@@ -1534,14 +1301,14 @@
     <w:pPr>
       <w:keepNext/>
       <w:keepLines/>
-      <w:spacing w:before="200" w:after="100" w:line="300" w:lineRule="auto"/>
+      <w:spacing w:before="200" w:after="0"/>
       <w:outlineLvl w:val="2"/>
     </w:pPr>
     <w:rPr>
-      <w:rFonts w:asciiTheme="majorHAnsi" w:eastAsiaTheme="majorEastAsia" w:hAnsiTheme="majorHAnsi" w:cstheme="majorBidi" w:ascii="Calibri" w:hAnsi="Calibri"/>
+      <w:rFonts w:asciiTheme="majorHAnsi" w:eastAsiaTheme="majorEastAsia" w:hAnsiTheme="majorHAnsi" w:cstheme="majorBidi" w:ascii="Georgia" w:hAnsi="Georgia"/>
       <w:b/>
       <w:bCs/>
-      <w:color w:val="1F4D78"/>
+      <w:color w:val="182646"/>
       <w:sz w:val="24"/>
     </w:rPr>
   </w:style>

</xml_diff>

<commit_message>
feat: add trilogy proof audit pack
</commit_message>
<xml_diff>
--- a/downloads/production/kdp/interior-finalization/lady-d-kdp-interior-finalization-kit.docx
+++ b/downloads/production/kdp/interior-finalization/lady-d-kdp-interior-finalization-kit.docx
@@ -17,7 +17,7 @@
     </w:p>
     <w:p>
       <w:r>
-        <w:t>Repo commit at generation: 616fc26</w:t>
+        <w:t>Repo commit at generation: 6d1dc28</w:t>
       </w:r>
     </w:p>
     <w:p>
@@ -444,6 +444,14 @@
         <w:pStyle w:val="ListBullet"/>
       </w:pPr>
       <w:r>
+        <w:t>Trilogy proof and copyedit audit pack with repetition ledgers, theological watchlist contexts, and volume proof checklists.</w:t>
+      </w:r>
+    </w:p>
+    <w:p>
+      <w:pPr>
+        <w:pStyle w:val="ListBullet"/>
+      </w:pPr>
+      <w:r>
         <w:t>Public Vercel review page for author-facing review.</w:t>
       </w:r>
     </w:p>
@@ -796,6 +804,14 @@
         <w:pStyle w:val="ListBullet"/>
       </w:pPr>
       <w:r>
+        <w:t>Resolve repeated title and morning-impact decisions from the proof audit pack.</w:t>
+      </w:r>
+    </w:p>
+    <w:p>
+      <w:pPr>
+        <w:pStyle w:val="ListBullet"/>
+      </w:pPr>
+      <w:r>
         <w:t>KDP Previewer pass for each upload file.</w:t>
       </w:r>
     </w:p>
@@ -817,7 +833,7 @@
     </w:p>
     <w:p>
       <w:r>
-        <w:t>Use the devotional and companion journal 6 x 9 review drafts plus the release upload readiness pack as the next trilogy-wide copyedit and theological proof surface. Once each volume and journal is approved, finalize metadata, then regenerate the full-wrap covers from the locked page counts and paper type.</w:t>
+        <w:t>Use the devotional and companion journal 6 x 9 review drafts plus the release upload readiness pack and trilogy proof audit pack as the next trilogy-wide copyedit and theological proof surface. Once each volume and journal is approved, finalize metadata, then regenerate the full-wrap covers from the locked page counts and paper type.</w:t>
       </w:r>
     </w:p>
     <w:sectPr>

</xml_diff>

<commit_message>
feat: add proof decision resolution pack
</commit_message>
<xml_diff>
--- a/downloads/production/kdp/interior-finalization/lady-d-kdp-interior-finalization-kit.docx
+++ b/downloads/production/kdp/interior-finalization/lady-d-kdp-interior-finalization-kit.docx
@@ -17,7 +17,7 @@
     </w:p>
     <w:p>
       <w:r>
-        <w:t>Repo commit at generation: 6d1dc28</w:t>
+        <w:t>Repo commit at generation: 0a84f72</w:t>
       </w:r>
     </w:p>
     <w:p>
@@ -452,6 +452,14 @@
         <w:pStyle w:val="ListBullet"/>
       </w:pPr>
       <w:r>
+        <w:t>Proof decision resolution pack with 192 title, morning-impact, and theology decisions queued for the next editorial loop.</w:t>
+      </w:r>
+    </w:p>
+    <w:p>
+      <w:pPr>
+        <w:pStyle w:val="ListBullet"/>
+      </w:pPr>
+      <w:r>
         <w:t>Public Vercel review page for author-facing review.</w:t>
       </w:r>
     </w:p>
@@ -812,6 +820,14 @@
         <w:pStyle w:val="ListBullet"/>
       </w:pPr>
       <w:r>
+        <w:t>Apply the proof decision resolution queue and re-run the proof audit after manuscript changes.</w:t>
+      </w:r>
+    </w:p>
+    <w:p>
+      <w:pPr>
+        <w:pStyle w:val="ListBullet"/>
+      </w:pPr>
+      <w:r>
         <w:t>KDP Previewer pass for each upload file.</w:t>
       </w:r>
     </w:p>
@@ -833,7 +849,7 @@
     </w:p>
     <w:p>
       <w:r>
-        <w:t>Use the devotional and companion journal 6 x 9 review drafts plus the release upload readiness pack and trilogy proof audit pack as the next trilogy-wide copyedit and theological proof surface. Once each volume and journal is approved, finalize metadata, then regenerate the full-wrap covers from the locked page counts and paper type.</w:t>
+        <w:t>Use the devotional and companion journal 6 x 9 review drafts plus the release upload readiness pack, trilogy proof audit pack, and proof decision resolution pack as the next trilogy-wide copyedit and theological proof surface. Resolve theology contexts first, then title/morning-impact decisions, then finalize metadata and regenerate the full-wrap covers from locked page counts and paper type.</w:t>
       </w:r>
     </w:p>
     <w:sectPr>

</xml_diff>

<commit_message>
feat: apply proof decision queue
</commit_message>
<xml_diff>
--- a/downloads/production/kdp/interior-finalization/lady-d-kdp-interior-finalization-kit.docx
+++ b/downloads/production/kdp/interior-finalization/lady-d-kdp-interior-finalization-kit.docx
@@ -17,7 +17,7 @@
     </w:p>
     <w:p>
       <w:r>
-        <w:t>Repo commit at generation: 0a84f72</w:t>
+        <w:t>Repo commit at generation: 6ab403d</w:t>
       </w:r>
     </w:p>
     <w:p>
@@ -452,7 +452,15 @@
         <w:pStyle w:val="ListBullet"/>
       </w:pPr>
       <w:r>
-        <w:t>Proof decision resolution pack with 192 title, morning-impact, and theology decisions queued for the next editorial loop.</w:t>
+        <w:t>Proof decision resolution pack regenerated with zero current decision items.</w:t>
+      </w:r>
+    </w:p>
+    <w:p>
+      <w:pPr>
+        <w:pStyle w:val="ListBullet"/>
+      </w:pPr>
+      <w:r>
+        <w:t>Proof decision application pack generated; the prior 192-item title, morning-impact, and theology queue is preserved as evidence and now audits clear.</w:t>
       </w:r>
     </w:p>
     <w:p>
@@ -812,7 +820,7 @@
         <w:pStyle w:val="ListBullet"/>
       </w:pPr>
       <w:r>
-        <w:t>Resolve repeated title and morning-impact decisions from the proof audit pack.</w:t>
+        <w:t>Full author-voice copyedit after the proof decision queue clear.</w:t>
       </w:r>
     </w:p>
     <w:p>
@@ -820,7 +828,7 @@
         <w:pStyle w:val="ListBullet"/>
       </w:pPr>
       <w:r>
-        <w:t>Apply the proof decision resolution queue and re-run the proof audit after manuscript changes.</w:t>
+        <w:t>Author approval of companion journal rhythm and front/back matter.</w:t>
       </w:r>
     </w:p>
     <w:p>
@@ -849,7 +857,7 @@
     </w:p>
     <w:p>
       <w:r>
-        <w:t>Use the devotional and companion journal 6 x 9 review drafts plus the release upload readiness pack, trilogy proof audit pack, and proof decision resolution pack as the next trilogy-wide copyedit and theological proof surface. Resolve theology contexts first, then title/morning-impact decisions, then finalize metadata and regenerate the full-wrap covers from locked page counts and paper type.</w:t>
+        <w:t>Use the devotional and companion journal 6 x 9 review drafts plus the release upload readiness pack, trilogy proof audit pack, proof decision resolution pack, and proof decision application pack as the next trilogy-wide copyedit and theological proof surface. The proof decision queue is clear; the next gate is full author-voice copyedit, metadata approval, and final cover regeneration from locked page counts and paper type.</w:t>
       </w:r>
     </w:p>
     <w:sectPr>

</xml_diff>

<commit_message>
feat: add author voice copyedit gate
</commit_message>
<xml_diff>
--- a/downloads/production/kdp/interior-finalization/lady-d-kdp-interior-finalization-kit.docx
+++ b/downloads/production/kdp/interior-finalization/lady-d-kdp-interior-finalization-kit.docx
@@ -17,7 +17,7 @@
     </w:p>
     <w:p>
       <w:r>
-        <w:t>Repo commit at generation: 6ab403d</w:t>
+        <w:t>Repo commit at generation: 9aab4b1</w:t>
       </w:r>
     </w:p>
     <w:p>
@@ -468,6 +468,14 @@
         <w:pStyle w:val="ListBullet"/>
       </w:pPr>
       <w:r>
+        <w:t>Reader-facing lens application and author-voice copyedit gate generated; the source and public manuscript mirrors now audit at 1,098 context/language lenses and zero internal production labels.</w:t>
+      </w:r>
+    </w:p>
+    <w:p>
+      <w:pPr>
+        <w:pStyle w:val="ListBullet"/>
+      </w:pPr>
+      <w:r>
         <w:t>Public Vercel review page for author-facing review.</w:t>
       </w:r>
     </w:p>
@@ -820,7 +828,7 @@
         <w:pStyle w:val="ListBullet"/>
       </w:pPr>
       <w:r>
-        <w:t>Full author-voice copyedit after the proof decision queue clear.</w:t>
+        <w:t>Full author-voice line edit using the author-voice copyedit gate.</w:t>
       </w:r>
     </w:p>
     <w:p>
@@ -857,7 +865,7 @@
     </w:p>
     <w:p>
       <w:r>
-        <w:t>Use the devotional and companion journal 6 x 9 review drafts plus the release upload readiness pack, trilogy proof audit pack, proof decision resolution pack, and proof decision application pack as the next trilogy-wide copyedit and theological proof surface. The proof decision queue is clear; the next gate is full author-voice copyedit, metadata approval, and final cover regeneration from locked page counts and paper type.</w:t>
+        <w:t>Use the devotional and companion journal 6 x 9 review drafts plus the release upload readiness pack, trilogy proof audit pack, proof decision resolution pack, proof decision application pack, and author-voice copyedit gate as the next trilogy-wide copyedit and theological proof surface. The proof decision queue is clear; the next gate is full author-voice line edit, metadata approval, and final cover regeneration from locked page counts and paper type.</w:t>
       </w:r>
     </w:p>
     <w:sectPr>

</xml_diff>

<commit_message>
Add Volume 1 line edit review pack
</commit_message>
<xml_diff>
--- a/downloads/production/kdp/interior-finalization/lady-d-kdp-interior-finalization-kit.docx
+++ b/downloads/production/kdp/interior-finalization/lady-d-kdp-interior-finalization-kit.docx
@@ -17,7 +17,7 @@
     </w:p>
     <w:p>
       <w:r>
-        <w:t>Repo commit at generation: 9aab4b1</w:t>
+        <w:t>Repo commit at generation: 6980a41</w:t>
       </w:r>
     </w:p>
     <w:p>
@@ -167,7 +167,7 @@
           </w:tcPr>
           <w:p>
             <w:r>
-              <w:t>409</w:t>
+              <w:t>369</w:t>
             </w:r>
           </w:p>
         </w:tc>
@@ -187,7 +187,7 @@
           </w:tcPr>
           <w:p>
             <w:r>
-              <w:t>13.171 x 9.250 in / 13.273 x 9.250 in</w:t>
+              <w:t>13.081 x 9.250 in / 13.173 x 9.250 in</w:t>
             </w:r>
           </w:p>
         </w:tc>
@@ -229,7 +229,7 @@
           </w:tcPr>
           <w:p>
             <w:r>
-              <w:t>350</w:t>
+              <w:t>369</w:t>
             </w:r>
           </w:p>
         </w:tc>
@@ -249,7 +249,7 @@
           </w:tcPr>
           <w:p>
             <w:r>
-              <w:t>13.038 x 9.250 in / 13.125 x 9.250 in</w:t>
+              <w:t>13.081 x 9.250 in / 13.173 x 9.250 in</w:t>
             </w:r>
           </w:p>
         </w:tc>
@@ -291,7 +291,7 @@
           </w:tcPr>
           <w:p>
             <w:r>
-              <w:t>339</w:t>
+              <w:t>369</w:t>
             </w:r>
           </w:p>
         </w:tc>
@@ -311,7 +311,7 @@
           </w:tcPr>
           <w:p>
             <w:r>
-              <w:t>13.013 x 9.250 in / 13.098 x 9.250 in</w:t>
+              <w:t>13.081 x 9.250 in / 13.173 x 9.250 in</w:t>
             </w:r>
           </w:p>
         </w:tc>
@@ -469,6 +469,14 @@
       </w:pPr>
       <w:r>
         <w:t>Reader-facing lens application and author-voice copyedit gate generated; the source and public manuscript mirrors now audit at 1,098 context/language lenses and zero internal production labels.</w:t>
+      </w:r>
+    </w:p>
+    <w:p>
+      <w:pPr>
+        <w:pStyle w:val="ListBullet"/>
+      </w:pPr>
+      <w:r>
+        <w:t>Volume 1 Days 001-007 author-voice line edit completed; the pilot batch now has seven varied morning-impact lines, zero old Volume 1 impact templates, zero internal production labels, and zero Sunday mentions.</w:t>
       </w:r>
     </w:p>
     <w:p>
@@ -828,7 +836,7 @@
         <w:pStyle w:val="ListBullet"/>
       </w:pPr>
       <w:r>
-        <w:t>Full author-voice line edit using the author-voice copyedit gate.</w:t>
+        <w:t>Continue author-voice line edits beyond the completed Volume 1 Days 001-007 pilot batch.</w:t>
       </w:r>
     </w:p>
     <w:p>
@@ -865,7 +873,7 @@
     </w:p>
     <w:p>
       <w:r>
-        <w:t>Use the devotional and companion journal 6 x 9 review drafts plus the release upload readiness pack, trilogy proof audit pack, proof decision resolution pack, proof decision application pack, and author-voice copyedit gate as the next trilogy-wide copyedit and theological proof surface. The proof decision queue is clear; the next gate is full author-voice line edit, metadata approval, and final cover regeneration from locked page counts and paper type.</w:t>
+        <w:t>Use the devotional and companion journal 6 x 9 review drafts plus the release upload readiness pack, trilogy proof audit pack, proof decision resolution pack, proof decision application pack, author-voice copyedit gate, and completed Volume 1 Days 001-007 line-edit batch as the next trilogy-wide copyedit and theological proof surface. The proof decision queue is clear; continue seven-day author-voice line edits, metadata approval, and final cover regeneration from locked page counts and paper type.</w:t>
       </w:r>
     </w:p>
     <w:sectPr>

</xml_diff>

<commit_message>
Add Volume 1 Days 008-014 line edit
</commit_message>
<xml_diff>
--- a/downloads/production/kdp/interior-finalization/lady-d-kdp-interior-finalization-kit.docx
+++ b/downloads/production/kdp/interior-finalization/lady-d-kdp-interior-finalization-kit.docx
@@ -17,7 +17,7 @@
     </w:p>
     <w:p>
       <w:r>
-        <w:t>Repo commit at generation: 6980a41</w:t>
+        <w:t>Repo commit at generation: d6774d4</w:t>
       </w:r>
     </w:p>
     <w:p>
@@ -476,7 +476,7 @@
         <w:pStyle w:val="ListBullet"/>
       </w:pPr>
       <w:r>
-        <w:t>Volume 1 Days 001-007 author-voice line edit completed; the pilot batch now has seven varied morning-impact lines, zero old Volume 1 impact templates, zero internal production labels, and zero Sunday mentions.</w:t>
+        <w:t>Volume 1 Days 001-014 author-voice line edits completed across two seven-day batches; the edited batches now have 14 varied morning-impact lines, zero old Volume 1 impact templates, zero internal production labels, and zero Sunday mentions.</w:t>
       </w:r>
     </w:p>
     <w:p>
@@ -836,7 +836,7 @@
         <w:pStyle w:val="ListBullet"/>
       </w:pPr>
       <w:r>
-        <w:t>Continue author-voice line edits beyond the completed Volume 1 Days 001-007 pilot batch.</w:t>
+        <w:t>Continue author-voice line edits beyond the completed Volume 1 Days 001-014 batches.</w:t>
       </w:r>
     </w:p>
     <w:p>
@@ -873,7 +873,7 @@
     </w:p>
     <w:p>
       <w:r>
-        <w:t>Use the devotional and companion journal 6 x 9 review drafts plus the release upload readiness pack, trilogy proof audit pack, proof decision resolution pack, proof decision application pack, author-voice copyedit gate, and completed Volume 1 Days 001-007 line-edit batch as the next trilogy-wide copyedit and theological proof surface. The proof decision queue is clear; continue seven-day author-voice line edits, metadata approval, and final cover regeneration from locked page counts and paper type.</w:t>
+        <w:t>Use the devotional and companion journal 6 x 9 review drafts plus the release upload readiness pack, trilogy proof audit pack, proof decision resolution pack, proof decision application pack, author-voice copyedit gate, and completed Volume 1 Days 001-014 line-edit batches as the next trilogy-wide copyedit and theological proof surface. The proof decision queue is clear; continue seven-day author-voice line edits, metadata approval, and final cover regeneration from locked page counts and paper type.</w:t>
       </w:r>
     </w:p>
     <w:sectPr>

</xml_diff>

<commit_message>
Add Volume 1 Days 015-021 line edit
</commit_message>
<xml_diff>
--- a/downloads/production/kdp/interior-finalization/lady-d-kdp-interior-finalization-kit.docx
+++ b/downloads/production/kdp/interior-finalization/lady-d-kdp-interior-finalization-kit.docx
@@ -17,7 +17,7 @@
     </w:p>
     <w:p>
       <w:r>
-        <w:t>Repo commit at generation: d6774d4</w:t>
+        <w:t>Repo commit at generation: 575ac63</w:t>
       </w:r>
     </w:p>
     <w:p>
@@ -476,7 +476,7 @@
         <w:pStyle w:val="ListBullet"/>
       </w:pPr>
       <w:r>
-        <w:t>Volume 1 Days 001-014 author-voice line edits completed across two seven-day batches; the edited batches now have 14 varied morning-impact lines, zero old Volume 1 impact templates, zero internal production labels, and zero Sunday mentions.</w:t>
+        <w:t>Volume 1 Days 001-021 author-voice line edits completed across three seven-day batches; the edited batches now have 21 varied morning-impact lines, zero old Volume 1 impact templates, zero internal production labels, and zero Sunday mentions.</w:t>
       </w:r>
     </w:p>
     <w:p>
@@ -836,7 +836,7 @@
         <w:pStyle w:val="ListBullet"/>
       </w:pPr>
       <w:r>
-        <w:t>Continue author-voice line edits beyond the completed Volume 1 Days 001-014 batches.</w:t>
+        <w:t>Continue author-voice line edits beyond the completed Volume 1 Days 001-021 batches.</w:t>
       </w:r>
     </w:p>
     <w:p>
@@ -873,7 +873,7 @@
     </w:p>
     <w:p>
       <w:r>
-        <w:t>Use the devotional and companion journal 6 x 9 review drafts plus the release upload readiness pack, trilogy proof audit pack, proof decision resolution pack, proof decision application pack, author-voice copyedit gate, and completed Volume 1 Days 001-014 line-edit batches as the next trilogy-wide copyedit and theological proof surface. The proof decision queue is clear; continue seven-day author-voice line edits, metadata approval, and final cover regeneration from locked page counts and paper type.</w:t>
+        <w:t>Use the devotional and companion journal 6 x 9 review drafts plus the release upload readiness pack, trilogy proof audit pack, proof decision resolution pack, proof decision application pack, author-voice copyedit gate, and completed Volume 1 Days 001-021 line-edit batches as the next trilogy-wide copyedit and theological proof surface. The proof decision queue is clear; continue seven-day author-voice line edits, metadata approval, and final cover regeneration from locked page counts and paper type.</w:t>
       </w:r>
     </w:p>
     <w:sectPr>

</xml_diff>

<commit_message>
Add Volume 1 Days 022-028 line edit
</commit_message>
<xml_diff>
--- a/downloads/production/kdp/interior-finalization/lady-d-kdp-interior-finalization-kit.docx
+++ b/downloads/production/kdp/interior-finalization/lady-d-kdp-interior-finalization-kit.docx
@@ -17,7 +17,7 @@
     </w:p>
     <w:p>
       <w:r>
-        <w:t>Repo commit at generation: 575ac63</w:t>
+        <w:t>Repo commit at generation: 30c0fa4</w:t>
       </w:r>
     </w:p>
     <w:p>
@@ -476,7 +476,7 @@
         <w:pStyle w:val="ListBullet"/>
       </w:pPr>
       <w:r>
-        <w:t>Volume 1 Days 001-021 author-voice line edits completed across three seven-day batches; the edited batches now have 21 varied morning-impact lines, zero old Volume 1 impact templates, zero internal production labels, and zero Sunday mentions.</w:t>
+        <w:t>Volume 1 Days 001-028 author-voice line edits completed across four seven-day batches; the edited batches now have 28 varied morning-impact lines, zero old Volume 1 impact templates, zero internal production labels, and zero Sunday mentions.</w:t>
       </w:r>
     </w:p>
     <w:p>
@@ -836,7 +836,7 @@
         <w:pStyle w:val="ListBullet"/>
       </w:pPr>
       <w:r>
-        <w:t>Continue author-voice line edits beyond the completed Volume 1 Days 001-021 batches.</w:t>
+        <w:t>Continue author-voice line edits beyond the completed Volume 1 Days 001-028 batches.</w:t>
       </w:r>
     </w:p>
     <w:p>
@@ -873,7 +873,7 @@
     </w:p>
     <w:p>
       <w:r>
-        <w:t>Use the devotional and companion journal 6 x 9 review drafts plus the release upload readiness pack, trilogy proof audit pack, proof decision resolution pack, proof decision application pack, author-voice copyedit gate, and completed Volume 1 Days 001-021 line-edit batches as the next trilogy-wide copyedit and theological proof surface. The proof decision queue is clear; continue seven-day author-voice line edits, metadata approval, and final cover regeneration from locked page counts and paper type.</w:t>
+        <w:t>Use the devotional and companion journal 6 x 9 review drafts plus the release upload readiness pack, trilogy proof audit pack, proof decision resolution pack, proof decision application pack, author-voice copyedit gate, and completed Volume 1 Days 001-028 line-edit batches as the next trilogy-wide copyedit and theological proof surface. The proof decision queue is clear; continue seven-day author-voice line edits, metadata approval, and final cover regeneration from locked page counts and paper type.</w:t>
       </w:r>
     </w:p>
     <w:sectPr>

</xml_diff>

<commit_message>
Complete Volume 1 January line edit
</commit_message>
<xml_diff>
--- a/downloads/production/kdp/interior-finalization/lady-d-kdp-interior-finalization-kit.docx
+++ b/downloads/production/kdp/interior-finalization/lady-d-kdp-interior-finalization-kit.docx
@@ -17,7 +17,7 @@
     </w:p>
     <w:p>
       <w:r>
-        <w:t>Repo commit at generation: 30c0fa4</w:t>
+        <w:t>Repo commit at generation: ff233b2</w:t>
       </w:r>
     </w:p>
     <w:p>
@@ -476,7 +476,7 @@
         <w:pStyle w:val="ListBullet"/>
       </w:pPr>
       <w:r>
-        <w:t>Volume 1 Days 001-028 author-voice line edits completed across four seven-day batches; the edited batches now have 28 varied morning-impact lines, zero old Volume 1 impact templates, zero internal production labels, and zero Sunday mentions.</w:t>
+        <w:t>Volume 1 January Days 001-031 author-voice line edits completed across four seven-day batches plus a three-day month closeout; the edited January surface now has 31 varied morning-impact lines, zero old Volume 1 impact templates, zero internal production labels, and zero Sunday mentions.</w:t>
       </w:r>
     </w:p>
     <w:p>
@@ -836,7 +836,7 @@
         <w:pStyle w:val="ListBullet"/>
       </w:pPr>
       <w:r>
-        <w:t>Continue author-voice line edits beyond the completed Volume 1 Days 001-028 batches.</w:t>
+        <w:t>Continue author-voice line edits beyond the completed Volume 1 January Days 001-031 batches.</w:t>
       </w:r>
     </w:p>
     <w:p>
@@ -873,7 +873,7 @@
     </w:p>
     <w:p>
       <w:r>
-        <w:t>Use the devotional and companion journal 6 x 9 review drafts plus the release upload readiness pack, trilogy proof audit pack, proof decision resolution pack, proof decision application pack, author-voice copyedit gate, and completed Volume 1 Days 001-028 line-edit batches as the next trilogy-wide copyedit and theological proof surface. The proof decision queue is clear; continue seven-day author-voice line edits, metadata approval, and final cover regeneration from locked page counts and paper type.</w:t>
+        <w:t>Use the devotional and companion journal 6 x 9 review drafts plus the release upload readiness pack, trilogy proof audit pack, proof decision resolution pack, proof decision application pack, author-voice copyedit gate, and completed Volume 1 January Days 001-031 line-edit batches as the next trilogy-wide copyedit and theological proof surface. The proof decision queue is clear; continue seven-day and month-close author-voice line edits, metadata approval, and final cover regeneration from locked page counts and paper type.</w:t>
       </w:r>
     </w:p>
     <w:sectPr>

</xml_diff>

<commit_message>
Add Volume 1 Days 032-038 line edit
</commit_message>
<xml_diff>
--- a/downloads/production/kdp/interior-finalization/lady-d-kdp-interior-finalization-kit.docx
+++ b/downloads/production/kdp/interior-finalization/lady-d-kdp-interior-finalization-kit.docx
@@ -17,7 +17,7 @@
     </w:p>
     <w:p>
       <w:r>
-        <w:t>Repo commit at generation: ff233b2</w:t>
+        <w:t>Repo commit at generation: 35b2cb1</w:t>
       </w:r>
     </w:p>
     <w:p>
@@ -476,7 +476,7 @@
         <w:pStyle w:val="ListBullet"/>
       </w:pPr>
       <w:r>
-        <w:t>Volume 1 January Days 001-031 author-voice line edits completed across four seven-day batches plus a three-day month closeout; the edited January surface now has 31 varied morning-impact lines, zero old Volume 1 impact templates, zero internal production labels, and zero Sunday mentions.</w:t>
+        <w:t>Volume 1 Days 001-038 author-voice line edits completed across five seven-day batches plus a three-day January closeout; the edited surface now has 38 varied morning-impact lines, zero old Volume 1 impact templates, zero internal production labels, and zero Sunday mentions.</w:t>
       </w:r>
     </w:p>
     <w:p>
@@ -836,7 +836,7 @@
         <w:pStyle w:val="ListBullet"/>
       </w:pPr>
       <w:r>
-        <w:t>Continue author-voice line edits beyond the completed Volume 1 January Days 001-031 batches.</w:t>
+        <w:t>Continue author-voice line edits beyond the completed Volume 1 Days 001-038 batches.</w:t>
       </w:r>
     </w:p>
     <w:p>
@@ -873,7 +873,7 @@
     </w:p>
     <w:p>
       <w:r>
-        <w:t>Use the devotional and companion journal 6 x 9 review drafts plus the release upload readiness pack, trilogy proof audit pack, proof decision resolution pack, proof decision application pack, author-voice copyedit gate, and completed Volume 1 January Days 001-031 line-edit batches as the next trilogy-wide copyedit and theological proof surface. The proof decision queue is clear; continue seven-day and month-close author-voice line edits, metadata approval, and final cover regeneration from locked page counts and paper type.</w:t>
+        <w:t>Use the devotional and companion journal 6 x 9 review drafts plus the release upload readiness pack, trilogy proof audit pack, proof decision resolution pack, proof decision application pack, author-voice copyedit gate, and completed Volume 1 Days 001-038 line-edit batches as the next trilogy-wide copyedit and theological proof surface. The proof decision queue is clear; continue seven-day and month-close author-voice line edits, metadata approval, and final cover regeneration from locked page counts and paper type.</w:t>
       </w:r>
     </w:p>
     <w:sectPr>

</xml_diff>

<commit_message>
Add Volume 1 Days 039-045 line edit
</commit_message>
<xml_diff>
--- a/downloads/production/kdp/interior-finalization/lady-d-kdp-interior-finalization-kit.docx
+++ b/downloads/production/kdp/interior-finalization/lady-d-kdp-interior-finalization-kit.docx
@@ -17,7 +17,7 @@
     </w:p>
     <w:p>
       <w:r>
-        <w:t>Repo commit at generation: 35b2cb1</w:t>
+        <w:t>Repo commit at generation: 903eb16</w:t>
       </w:r>
     </w:p>
     <w:p>
@@ -476,7 +476,7 @@
         <w:pStyle w:val="ListBullet"/>
       </w:pPr>
       <w:r>
-        <w:t>Volume 1 Days 001-038 author-voice line edits completed across five seven-day batches plus a three-day January closeout; the edited surface now has 38 varied morning-impact lines, zero old Volume 1 impact templates, zero internal production labels, and zero Sunday mentions.</w:t>
+        <w:t>Volume 1 Days 001-045 author-voice line edits completed across six seven-day batches plus a three-day January closeout; the edited surface now has 45 varied morning-impact lines, zero old Volume 1 impact templates, zero internal production labels, and zero Sunday mentions.</w:t>
       </w:r>
     </w:p>
     <w:p>
@@ -836,7 +836,7 @@
         <w:pStyle w:val="ListBullet"/>
       </w:pPr>
       <w:r>
-        <w:t>Continue author-voice line edits beyond the completed Volume 1 Days 001-038 batches.</w:t>
+        <w:t>Continue author-voice line edits beyond the completed Volume 1 Days 001-045 batches.</w:t>
       </w:r>
     </w:p>
     <w:p>
@@ -873,7 +873,7 @@
     </w:p>
     <w:p>
       <w:r>
-        <w:t>Use the devotional and companion journal 6 x 9 review drafts plus the release upload readiness pack, trilogy proof audit pack, proof decision resolution pack, proof decision application pack, author-voice copyedit gate, and completed Volume 1 Days 001-038 line-edit batches as the next trilogy-wide copyedit and theological proof surface. The proof decision queue is clear; continue seven-day and month-close author-voice line edits, metadata approval, and final cover regeneration from locked page counts and paper type.</w:t>
+        <w:t>Use the devotional and companion journal 6 x 9 review drafts plus the release upload readiness pack, trilogy proof audit pack, proof decision resolution pack, proof decision application pack, author-voice copyedit gate, and completed Volume 1 Days 001-045 line-edit batches as the next trilogy-wide copyedit and theological proof surface. The proof decision queue is clear; continue seven-day and month-close author-voice line edits, metadata approval, and final cover regeneration from locked page counts and paper type.</w:t>
       </w:r>
     </w:p>
     <w:sectPr>

</xml_diff>

<commit_message>
Add Volume 1 Days 046-052 line edit
</commit_message>
<xml_diff>
--- a/downloads/production/kdp/interior-finalization/lady-d-kdp-interior-finalization-kit.docx
+++ b/downloads/production/kdp/interior-finalization/lady-d-kdp-interior-finalization-kit.docx
@@ -17,7 +17,7 @@
     </w:p>
     <w:p>
       <w:r>
-        <w:t>Repo commit at generation: 903eb16</w:t>
+        <w:t>Repo commit at generation: 297346e</w:t>
       </w:r>
     </w:p>
     <w:p>
@@ -476,7 +476,7 @@
         <w:pStyle w:val="ListBullet"/>
       </w:pPr>
       <w:r>
-        <w:t>Volume 1 Days 001-045 author-voice line edits completed across six seven-day batches plus a three-day January closeout; the edited surface now has 45 varied morning-impact lines, zero old Volume 1 impact templates, zero internal production labels, and zero Sunday mentions.</w:t>
+        <w:t>Volume 1 Days 001-052 author-voice line edits completed across seven seven-day batches plus a three-day January closeout; the edited surface now has 52 varied morning-impact lines, zero old Volume 1 impact templates, zero internal production labels, and zero Sunday mentions.</w:t>
       </w:r>
     </w:p>
     <w:p>
@@ -836,7 +836,7 @@
         <w:pStyle w:val="ListBullet"/>
       </w:pPr>
       <w:r>
-        <w:t>Continue author-voice line edits beyond the completed Volume 1 Days 001-045 batches.</w:t>
+        <w:t>Continue author-voice line edits beyond the completed Volume 1 Days 001-052 batches.</w:t>
       </w:r>
     </w:p>
     <w:p>
@@ -873,7 +873,7 @@
     </w:p>
     <w:p>
       <w:r>
-        <w:t>Use the devotional and companion journal 6 x 9 review drafts plus the release upload readiness pack, trilogy proof audit pack, proof decision resolution pack, proof decision application pack, author-voice copyedit gate, and completed Volume 1 Days 001-045 line-edit batches as the next trilogy-wide copyedit and theological proof surface. The proof decision queue is clear; continue seven-day and month-close author-voice line edits, metadata approval, and final cover regeneration from locked page counts and paper type.</w:t>
+        <w:t>Use the devotional and companion journal 6 x 9 review drafts plus the release upload readiness pack, trilogy proof audit pack, proof decision resolution pack, proof decision application pack, author-voice copyedit gate, and completed Volume 1 Days 001-052 line-edit batches as the next trilogy-wide copyedit and theological proof surface. The proof decision queue is clear; continue seven-day and month-close author-voice line edits, metadata approval, and final cover regeneration from locked page counts and paper type.</w:t>
       </w:r>
     </w:p>
     <w:sectPr>

</xml_diff>

<commit_message>
Add Volume 1 Days 053-059 line edit
</commit_message>
<xml_diff>
--- a/downloads/production/kdp/interior-finalization/lady-d-kdp-interior-finalization-kit.docx
+++ b/downloads/production/kdp/interior-finalization/lady-d-kdp-interior-finalization-kit.docx
@@ -17,7 +17,7 @@
     </w:p>
     <w:p>
       <w:r>
-        <w:t>Repo commit at generation: 297346e</w:t>
+        <w:t>Repo commit at generation: e1226cb</w:t>
       </w:r>
     </w:p>
     <w:p>
@@ -476,7 +476,7 @@
         <w:pStyle w:val="ListBullet"/>
       </w:pPr>
       <w:r>
-        <w:t>Volume 1 Days 001-052 author-voice line edits completed across seven seven-day batches plus a three-day January closeout; the edited surface now has 52 varied morning-impact lines, zero old Volume 1 impact templates, zero internal production labels, and zero Sunday mentions.</w:t>
+        <w:t>Volume 1 Days 001-059 author-voice line edits completed across eight seven-day batches plus a three-day January closeout; the edited surface now has 59 varied morning-impact lines, zero old Volume 1 impact templates, zero internal production labels, and zero Sunday mentions.</w:t>
       </w:r>
     </w:p>
     <w:p>
@@ -836,7 +836,7 @@
         <w:pStyle w:val="ListBullet"/>
       </w:pPr>
       <w:r>
-        <w:t>Continue author-voice line edits beyond the completed Volume 1 Days 001-052 batches.</w:t>
+        <w:t>Continue author-voice line edits beyond the completed Volume 1 Days 001-059 batches.</w:t>
       </w:r>
     </w:p>
     <w:p>
@@ -873,7 +873,7 @@
     </w:p>
     <w:p>
       <w:r>
-        <w:t>Use the devotional and companion journal 6 x 9 review drafts plus the release upload readiness pack, trilogy proof audit pack, proof decision resolution pack, proof decision application pack, author-voice copyedit gate, and completed Volume 1 Days 001-052 line-edit batches as the next trilogy-wide copyedit and theological proof surface. The proof decision queue is clear; continue seven-day and month-close author-voice line edits, metadata approval, and final cover regeneration from locked page counts and paper type.</w:t>
+        <w:t>Use the devotional and companion journal 6 x 9 review drafts plus the release upload readiness pack, trilogy proof audit pack, proof decision resolution pack, proof decision application pack, author-voice copyedit gate, and completed Volume 1 Days 001-059 line-edit batches as the next trilogy-wide copyedit and theological proof surface. The proof decision queue is clear; continue seven-day, bonus-day, and month-close author-voice line edits, metadata approval, and final cover regeneration from locked page counts and paper type.</w:t>
       </w:r>
     </w:p>
     <w:sectPr>

</xml_diff>

<commit_message>
Add Volume 1 leap day and Days 060-066 line edit
</commit_message>
<xml_diff>
--- a/downloads/production/kdp/interior-finalization/lady-d-kdp-interior-finalization-kit.docx
+++ b/downloads/production/kdp/interior-finalization/lady-d-kdp-interior-finalization-kit.docx
@@ -17,7 +17,7 @@
     </w:p>
     <w:p>
       <w:r>
-        <w:t>Repo commit at generation: e1226cb</w:t>
+        <w:t>Repo commit at generation: c500c77</w:t>
       </w:r>
     </w:p>
     <w:p>
@@ -476,7 +476,7 @@
         <w:pStyle w:val="ListBullet"/>
       </w:pPr>
       <w:r>
-        <w:t>Volume 1 Days 001-059 author-voice line edits completed across eight seven-day batches plus a three-day January closeout; the edited surface now has 59 varied morning-impact lines, zero old Volume 1 impact templates, zero internal production labels, and zero Sunday mentions.</w:t>
+        <w:t>Volume 1 Days 001-067 author-voice line edits completed across eight seven-day batches, one eight-entry leap-day/March gate, plus a three-day January closeout; the edited surface now has 67 varied morning-impact lines, zero old Volume 1 impact templates, zero internal production labels, and zero Sunday mentions.</w:t>
       </w:r>
     </w:p>
     <w:p>
@@ -836,7 +836,7 @@
         <w:pStyle w:val="ListBullet"/>
       </w:pPr>
       <w:r>
-        <w:t>Continue author-voice line edits beyond the completed Volume 1 Days 001-059 batches.</w:t>
+        <w:t>Continue author-voice line edits beyond the completed Volume 1 Days 001-067 batches.</w:t>
       </w:r>
     </w:p>
     <w:p>
@@ -873,7 +873,7 @@
     </w:p>
     <w:p>
       <w:r>
-        <w:t>Use the devotional and companion journal 6 x 9 review drafts plus the release upload readiness pack, trilogy proof audit pack, proof decision resolution pack, proof decision application pack, author-voice copyedit gate, and completed Volume 1 Days 001-059 line-edit batches as the next trilogy-wide copyedit and theological proof surface. The proof decision queue is clear; continue seven-day, bonus-day, and month-close author-voice line edits, metadata approval, and final cover regeneration from locked page counts and paper type.</w:t>
+        <w:t>Use the devotional and companion journal 6 x 9 review drafts plus the release upload readiness pack, trilogy proof audit pack, proof decision resolution pack, proof decision application pack, author-voice copyedit gate, and completed Volume 1 Days 001-067 line-edit batches as the next trilogy-wide copyedit and theological proof surface. The proof decision queue is clear; continue seven-day, bonus-day, and month-close author-voice line edits, metadata approval, and final cover regeneration from locked page counts and paper type.</w:t>
       </w:r>
     </w:p>
     <w:sectPr>

</xml_diff>

<commit_message>
Add Volume 1 Days 067-073 line edit
</commit_message>
<xml_diff>
--- a/downloads/production/kdp/interior-finalization/lady-d-kdp-interior-finalization-kit.docx
+++ b/downloads/production/kdp/interior-finalization/lady-d-kdp-interior-finalization-kit.docx
@@ -17,7 +17,7 @@
     </w:p>
     <w:p>
       <w:r>
-        <w:t>Repo commit at generation: c500c77</w:t>
+        <w:t>Repo commit at generation: 245a378</w:t>
       </w:r>
     </w:p>
     <w:p>
@@ -476,7 +476,7 @@
         <w:pStyle w:val="ListBullet"/>
       </w:pPr>
       <w:r>
-        <w:t>Volume 1 Days 001-067 author-voice line edits completed across eight seven-day batches, one eight-entry leap-day/March gate, plus a three-day January closeout; the edited surface now has 67 varied morning-impact lines, zero old Volume 1 impact templates, zero internal production labels, and zero Sunday mentions.</w:t>
+        <w:t>Volume 1 Days 001-073, including Leap Day, author-voice line edits completed across nine seven-day batches, one eight-entry leap-day/March gate, plus a three-day January closeout; the edited surface now has 74 varied morning-impact lines, zero old Volume 1 impact templates, zero internal production labels, and zero Sunday mentions.</w:t>
       </w:r>
     </w:p>
     <w:p>
@@ -836,7 +836,7 @@
         <w:pStyle w:val="ListBullet"/>
       </w:pPr>
       <w:r>
-        <w:t>Continue author-voice line edits beyond the completed Volume 1 Days 001-067 batches.</w:t>
+        <w:t>Continue author-voice line edits beyond the completed Volume 1 Days 001-073 plus Leap Day batches.</w:t>
       </w:r>
     </w:p>
     <w:p>
@@ -873,7 +873,7 @@
     </w:p>
     <w:p>
       <w:r>
-        <w:t>Use the devotional and companion journal 6 x 9 review drafts plus the release upload readiness pack, trilogy proof audit pack, proof decision resolution pack, proof decision application pack, author-voice copyedit gate, and completed Volume 1 Days 001-067 line-edit batches as the next trilogy-wide copyedit and theological proof surface. The proof decision queue is clear; continue seven-day, bonus-day, and month-close author-voice line edits, metadata approval, and final cover regeneration from locked page counts and paper type.</w:t>
+        <w:t>Use the devotional and companion journal 6 x 9 review drafts plus the release upload readiness pack, trilogy proof audit pack, proof decision resolution pack, proof decision application pack, author-voice copyedit gate, and completed Volume 1 Days 001-073 plus Leap Day line-edit batches as the next trilogy-wide copyedit and theological proof surface. The proof decision queue is clear; continue seven-day, bonus-day, and month-close author-voice line edits, metadata approval, and final cover regeneration from locked page counts and paper type.</w:t>
       </w:r>
     </w:p>
     <w:sectPr>

</xml_diff>

<commit_message>
Add Volume 1 Days 074-080 line edit
</commit_message>
<xml_diff>
--- a/downloads/production/kdp/interior-finalization/lady-d-kdp-interior-finalization-kit.docx
+++ b/downloads/production/kdp/interior-finalization/lady-d-kdp-interior-finalization-kit.docx
@@ -17,7 +17,7 @@
     </w:p>
     <w:p>
       <w:r>
-        <w:t>Repo commit at generation: 245a378</w:t>
+        <w:t>Repo commit at generation: b12ddeb</w:t>
       </w:r>
     </w:p>
     <w:p>
@@ -476,7 +476,7 @@
         <w:pStyle w:val="ListBullet"/>
       </w:pPr>
       <w:r>
-        <w:t>Volume 1 Days 001-073, including Leap Day, author-voice line edits completed across nine seven-day batches, one eight-entry leap-day/March gate, plus a three-day January closeout; the edited surface now has 74 varied morning-impact lines, zero old Volume 1 impact templates, zero internal production labels, and zero Sunday mentions.</w:t>
+        <w:t>Volume 1 Days 001-080, including Leap Day, author-voice line edits completed across ten seven-day batches, one eight-entry leap-day/March gate, plus a three-day January closeout; the edited surface now has 81 varied morning-impact lines, zero old Volume 1 impact templates, zero internal production labels, and zero Sunday mentions.</w:t>
       </w:r>
     </w:p>
     <w:p>
@@ -836,7 +836,7 @@
         <w:pStyle w:val="ListBullet"/>
       </w:pPr>
       <w:r>
-        <w:t>Continue author-voice line edits beyond the completed Volume 1 Days 001-073 plus Leap Day batches.</w:t>
+        <w:t>Continue author-voice line edits beyond the completed Volume 1 Days 001-080 plus Leap Day batches.</w:t>
       </w:r>
     </w:p>
     <w:p>
@@ -873,7 +873,7 @@
     </w:p>
     <w:p>
       <w:r>
-        <w:t>Use the devotional and companion journal 6 x 9 review drafts plus the release upload readiness pack, trilogy proof audit pack, proof decision resolution pack, proof decision application pack, author-voice copyedit gate, and completed Volume 1 Days 001-073 plus Leap Day line-edit batches as the next trilogy-wide copyedit and theological proof surface. The proof decision queue is clear; continue seven-day, bonus-day, and month-close author-voice line edits, metadata approval, and final cover regeneration from locked page counts and paper type.</w:t>
+        <w:t>Use the devotional and companion journal 6 x 9 review drafts plus the release upload readiness pack, trilogy proof audit pack, proof decision resolution pack, proof decision application pack, author-voice copyedit gate, and completed Volume 1 Days 001-080 plus Leap Day line-edit batches as the next trilogy-wide copyedit and theological proof surface. The proof decision queue is clear; continue seven-day, bonus-day, and month-close author-voice line edits, metadata approval, and final cover regeneration from locked page counts and paper type.</w:t>
       </w:r>
     </w:p>
     <w:sectPr>

</xml_diff>

<commit_message>
Add Volume 1 Days 081-087 line edit
</commit_message>
<xml_diff>
--- a/downloads/production/kdp/interior-finalization/lady-d-kdp-interior-finalization-kit.docx
+++ b/downloads/production/kdp/interior-finalization/lady-d-kdp-interior-finalization-kit.docx
@@ -17,7 +17,7 @@
     </w:p>
     <w:p>
       <w:r>
-        <w:t>Repo commit at generation: b12ddeb</w:t>
+        <w:t>Repo commit at generation: 0f0d1c4</w:t>
       </w:r>
     </w:p>
     <w:p>
@@ -476,7 +476,7 @@
         <w:pStyle w:val="ListBullet"/>
       </w:pPr>
       <w:r>
-        <w:t>Volume 1 Days 001-080, including Leap Day, author-voice line edits completed across ten seven-day batches, one eight-entry leap-day/March gate, plus a three-day January closeout; the edited surface now has 81 varied morning-impact lines, zero old Volume 1 impact templates, zero internal production labels, and zero Sunday mentions.</w:t>
+        <w:t>Volume 1 Days 001-087, including Leap Day, author-voice line edits completed across eleven seven-day batches, one eight-entry leap-day/March gate, plus a three-day January closeout; the edited surface now has 88 varied morning-impact lines, zero old Volume 1 impact templates, zero internal production labels, and zero Sunday mentions.</w:t>
       </w:r>
     </w:p>
     <w:p>
@@ -836,7 +836,7 @@
         <w:pStyle w:val="ListBullet"/>
       </w:pPr>
       <w:r>
-        <w:t>Continue author-voice line edits beyond the completed Volume 1 Days 001-080 plus Leap Day batches.</w:t>
+        <w:t>Continue author-voice line edits beyond the completed Volume 1 Days 001-087 plus Leap Day batches.</w:t>
       </w:r>
     </w:p>
     <w:p>
@@ -873,7 +873,7 @@
     </w:p>
     <w:p>
       <w:r>
-        <w:t>Use the devotional and companion journal 6 x 9 review drafts plus the release upload readiness pack, trilogy proof audit pack, proof decision resolution pack, proof decision application pack, author-voice copyedit gate, and completed Volume 1 Days 001-080 plus Leap Day line-edit batches as the next trilogy-wide copyedit and theological proof surface. The proof decision queue is clear; continue seven-day, bonus-day, and month-close author-voice line edits, metadata approval, and final cover regeneration from locked page counts and paper type.</w:t>
+        <w:t>Use the devotional and companion journal 6 x 9 review drafts plus the release upload readiness pack, trilogy proof audit pack, proof decision resolution pack, proof decision application pack, author-voice copyedit gate, and completed Volume 1 Days 001-087 plus Leap Day line-edit batches as the next trilogy-wide copyedit and theological proof surface. The proof decision queue is clear; continue seven-day, bonus-day, and month-close author-voice line edits, metadata approval, and final cover regeneration from locked page counts and paper type.</w:t>
       </w:r>
     </w:p>
     <w:sectPr>

</xml_diff>

<commit_message>
Add Volume 1 Days 088-094 line edit
</commit_message>
<xml_diff>
--- a/downloads/production/kdp/interior-finalization/lady-d-kdp-interior-finalization-kit.docx
+++ b/downloads/production/kdp/interior-finalization/lady-d-kdp-interior-finalization-kit.docx
@@ -17,7 +17,7 @@
     </w:p>
     <w:p>
       <w:r>
-        <w:t>Repo commit at generation: 0f0d1c4</w:t>
+        <w:t>Repo commit at generation: f85e049</w:t>
       </w:r>
     </w:p>
     <w:p>
@@ -476,7 +476,7 @@
         <w:pStyle w:val="ListBullet"/>
       </w:pPr>
       <w:r>
-        <w:t>Volume 1 Days 001-087, including Leap Day, author-voice line edits completed across eleven seven-day batches, one eight-entry leap-day/March gate, plus a three-day January closeout; the edited surface now has 88 varied morning-impact lines, zero old Volume 1 impact templates, zero internal production labels, and zero Sunday mentions.</w:t>
+        <w:t>Volume 1 Days 001-094, including Leap Day, author-voice line edits completed across twelve seven-day batches, one eight-entry leap-day/March gate, plus a three-day January closeout; the edited surface now has 95 varied morning-impact lines, zero old Volume 1 impact templates, zero internal production labels, and zero Sunday mentions.</w:t>
       </w:r>
     </w:p>
     <w:p>
@@ -836,7 +836,7 @@
         <w:pStyle w:val="ListBullet"/>
       </w:pPr>
       <w:r>
-        <w:t>Continue author-voice line edits beyond the completed Volume 1 Days 001-087 plus Leap Day batches.</w:t>
+        <w:t>Continue author-voice line edits beyond the completed Volume 1 Days 001-094 plus Leap Day batches.</w:t>
       </w:r>
     </w:p>
     <w:p>
@@ -873,7 +873,7 @@
     </w:p>
     <w:p>
       <w:r>
-        <w:t>Use the devotional and companion journal 6 x 9 review drafts plus the release upload readiness pack, trilogy proof audit pack, proof decision resolution pack, proof decision application pack, author-voice copyedit gate, and completed Volume 1 Days 001-087 plus Leap Day line-edit batches as the next trilogy-wide copyedit and theological proof surface. The proof decision queue is clear; continue seven-day, bonus-day, and month-close author-voice line edits, metadata approval, and final cover regeneration from locked page counts and paper type.</w:t>
+        <w:t>Use the devotional and companion journal 6 x 9 review drafts plus the release upload readiness pack, trilogy proof audit pack, proof decision resolution pack, proof decision application pack, author-voice copyedit gate, and completed Volume 1 Days 001-094 plus Leap Day line-edit batches as the next trilogy-wide copyedit and theological proof surface. The proof decision queue is clear; continue seven-day, bonus-day, and month-close author-voice line edits, metadata approval, and final cover regeneration from locked page counts and paper type.</w:t>
       </w:r>
     </w:p>
     <w:sectPr>

</xml_diff>

<commit_message>
Add Volume 1 Days 095-101 line edit
</commit_message>
<xml_diff>
--- a/downloads/production/kdp/interior-finalization/lady-d-kdp-interior-finalization-kit.docx
+++ b/downloads/production/kdp/interior-finalization/lady-d-kdp-interior-finalization-kit.docx
@@ -17,7 +17,7 @@
     </w:p>
     <w:p>
       <w:r>
-        <w:t>Repo commit at generation: f85e049</w:t>
+        <w:t>Repo commit at generation: b4f7c7a</w:t>
       </w:r>
     </w:p>
     <w:p>
@@ -476,7 +476,7 @@
         <w:pStyle w:val="ListBullet"/>
       </w:pPr>
       <w:r>
-        <w:t>Volume 1 Days 001-094, including Leap Day, author-voice line edits completed across twelve seven-day batches, one eight-entry leap-day/March gate, plus a three-day January closeout; the edited surface now has 95 varied morning-impact lines, zero old Volume 1 impact templates, zero internal production labels, and zero Sunday mentions.</w:t>
+        <w:t>Volume 1 Days 001-101, including Leap Day, author-voice line edits completed across thirteen seven-day batches, one eight-entry leap-day/March gate, plus a three-day January closeout; the edited surface now has 102 varied morning-impact lines, zero old Volume 1 impact templates, zero internal production labels, and zero Sunday mentions.</w:t>
       </w:r>
     </w:p>
     <w:p>
@@ -836,7 +836,7 @@
         <w:pStyle w:val="ListBullet"/>
       </w:pPr>
       <w:r>
-        <w:t>Continue author-voice line edits beyond the completed Volume 1 Days 001-094 plus Leap Day batches.</w:t>
+        <w:t>Continue author-voice line edits beyond the completed Volume 1 Days 001-101 plus Leap Day batches.</w:t>
       </w:r>
     </w:p>
     <w:p>
@@ -873,7 +873,7 @@
     </w:p>
     <w:p>
       <w:r>
-        <w:t>Use the devotional and companion journal 6 x 9 review drafts plus the release upload readiness pack, trilogy proof audit pack, proof decision resolution pack, proof decision application pack, author-voice copyedit gate, and completed Volume 1 Days 001-094 plus Leap Day line-edit batches as the next trilogy-wide copyedit and theological proof surface. The proof decision queue is clear; continue seven-day, bonus-day, and month-close author-voice line edits, metadata approval, and final cover regeneration from locked page counts and paper type.</w:t>
+        <w:t>Use the devotional and companion journal 6 x 9 review drafts plus the release upload readiness pack, trilogy proof audit pack, proof decision resolution pack, proof decision application pack, author-voice copyedit gate, and completed Volume 1 Days 001-101 plus Leap Day line-edit batches as the next trilogy-wide copyedit and theological proof surface. The proof decision queue is clear; continue seven-day, bonus-day, and month-close author-voice line edits, metadata approval, and final cover regeneration from locked page counts and paper type.</w:t>
       </w:r>
     </w:p>
     <w:sectPr>

</xml_diff>

<commit_message>
Add author decision gate and Days 102-108 line edit
</commit_message>
<xml_diff>
--- a/downloads/production/kdp/interior-finalization/lady-d-kdp-interior-finalization-kit.docx
+++ b/downloads/production/kdp/interior-finalization/lady-d-kdp-interior-finalization-kit.docx
@@ -17,7 +17,7 @@
     </w:p>
     <w:p>
       <w:r>
-        <w:t>Repo commit at generation: b4f7c7a</w:t>
+        <w:t>Repo commit at generation: 02fe20d</w:t>
       </w:r>
     </w:p>
     <w:p>
@@ -476,7 +476,15 @@
         <w:pStyle w:val="ListBullet"/>
       </w:pPr>
       <w:r>
-        <w:t>Volume 1 Days 001-101, including Leap Day, author-voice line edits completed across thirteen seven-day batches, one eight-entry leap-day/March gate, plus a three-day January closeout; the edited surface now has 102 varied morning-impact lines, zero old Volume 1 impact templates, zero internal production labels, and zero Sunday mentions.</w:t>
+        <w:t>Author decision sheet generated with title, Bible policy, cover, front/back matter, launch order, Adventist guardrail, source-freeze, and KDP copy-economics approval fields.</w:t>
+      </w:r>
+    </w:p>
+    <w:p>
+      <w:pPr>
+        <w:pStyle w:val="ListBullet"/>
+      </w:pPr>
+      <w:r>
+        <w:t>Volume 1 Days 001-108, including Leap Day, author-voice line edits completed across fourteen seven-day batches, one eight-entry leap-day/March gate, plus a three-day January closeout; the edited surface now has 109 varied morning-impact lines, zero old Volume 1 impact templates, zero internal production labels, and zero Sunday mentions.</w:t>
       </w:r>
     </w:p>
     <w:p>
@@ -836,7 +844,15 @@
         <w:pStyle w:val="ListBullet"/>
       </w:pPr>
       <w:r>
-        <w:t>Continue author-voice line edits beyond the completed Volume 1 Days 001-101 plus Leap Day batches.</w:t>
+        <w:t>Author approval of the decision sheet: titles, Bible policy, cover direction, bio, dedication, acknowledgments, and launch order.</w:t>
+      </w:r>
+    </w:p>
+    <w:p>
+      <w:pPr>
+        <w:pStyle w:val="ListBullet"/>
+      </w:pPr>
+      <w:r>
+        <w:t>Continue author-voice line edits beyond the completed Volume 1 Days 001-108 plus Leap Day batches.</w:t>
       </w:r>
     </w:p>
     <w:p>
@@ -873,7 +889,7 @@
     </w:p>
     <w:p>
       <w:r>
-        <w:t>Use the devotional and companion journal 6 x 9 review drafts plus the release upload readiness pack, trilogy proof audit pack, proof decision resolution pack, proof decision application pack, author-voice copyedit gate, and completed Volume 1 Days 001-101 plus Leap Day line-edit batches as the next trilogy-wide copyedit and theological proof surface. The proof decision queue is clear; continue seven-day, bonus-day, and month-close author-voice line edits, metadata approval, and final cover regeneration from locked page counts and paper type.</w:t>
+        <w:t>Use the devotional and companion journal 6 x 9 review drafts plus the release upload readiness pack, trilogy proof audit pack, proof decision resolution pack, proof decision application pack, author decision sheet, author-voice copyedit gate, and completed Volume 1 Days 001-108 plus Leap Day line-edit batches as the next trilogy-wide copyedit and theological proof surface. The proof decision queue is clear; continue seven-day, bonus-day, and month-close author-voice line edits, metadata approval, and final cover regeneration from locked page counts and paper type.</w:t>
       </w:r>
     </w:p>
     <w:sectPr>

</xml_diff>